<commit_message>
Added Docker containerization files for Tooling and PHP-Todo apps
</commit_message>
<xml_diff>
--- a/project13/word_submission.docx
+++ b/project13/word_submission.docx
@@ -18,17 +18,40 @@
           <w:bCs/>
           <w:sz w:val="24"/>
         </w:rPr>
-        <w:t>CI/CD Pipeline Implementation for PHP Applications</w:t>
-      </w:r>
-    </w:p>
-    <w:p>
-      <w:pPr>
+        <w:t>Project 14: PHP CI/CD Pipeline - Updated Submission</w:t>
+      </w:r>
+    </w:p>
+    <w:p>
+      <w:pPr>
+        <w:rPr>
+          <w:rFonts w:ascii="Times New Roman" w:hAnsi="Times New Roman" w:cs="Times New Roman"/>
+          <w:sz w:val="24"/>
+        </w:rPr>
+      </w:pPr>
+      <w:r>
         <w:rPr>
           <w:rFonts w:ascii="Times New Roman" w:hAnsi="Times New Roman" w:cs="Times New Roman"/>
           <w:b/>
           <w:bCs/>
           <w:sz w:val="24"/>
         </w:rPr>
+        <w:t>GitHub Repository URL:</w:t>
+      </w:r>
+      <w:r>
+        <w:rPr>
+          <w:rFonts w:ascii="Times New Roman" w:hAnsi="Times New Roman" w:cs="Times New Roman"/>
+          <w:sz w:val="24"/>
+        </w:rPr>
+        <w:br/>
+        <w:t>https://github.com/123Origami/StegHub_DevOps/blob/main/project13</w:t>
+      </w:r>
+    </w:p>
+    <w:p>
+      <w:pPr>
+        <w:rPr>
+          <w:rFonts w:ascii="Times New Roman" w:hAnsi="Times New Roman" w:cs="Times New Roman"/>
+          <w:sz w:val="24"/>
+        </w:rPr>
       </w:pPr>
       <w:r>
         <w:rPr>
@@ -37,97 +60,471 @@
           <w:bCs/>
           <w:sz w:val="24"/>
         </w:rPr>
-        <w:t xml:space="preserve">Name: Sally </w:t>
+        <w:t>Project Overview:</w:t>
+      </w:r>
+      <w:r>
+        <w:rPr>
+          <w:rFonts w:ascii="Times New Roman" w:hAnsi="Times New Roman" w:cs="Times New Roman"/>
+          <w:sz w:val="24"/>
+        </w:rPr>
+        <w:br/>
+        <w:t xml:space="preserve">This project implements a complete CI/CD pipeline for PHP applications using Jenkins, </w:t>
       </w:r>
       <w:proofErr w:type="spellStart"/>
       <w:r>
+        <w:rPr>
+          <w:rFonts w:ascii="Times New Roman" w:hAnsi="Times New Roman" w:cs="Times New Roman"/>
+          <w:sz w:val="24"/>
+        </w:rPr>
+        <w:t>Ansible</w:t>
+      </w:r>
+      <w:proofErr w:type="spellEnd"/>
+      <w:r>
+        <w:rPr>
+          <w:rFonts w:ascii="Times New Roman" w:hAnsi="Times New Roman" w:cs="Times New Roman"/>
+          <w:sz w:val="24"/>
+        </w:rPr>
+        <w:t xml:space="preserve">, </w:t>
+      </w:r>
+      <w:proofErr w:type="spellStart"/>
+      <w:r>
+        <w:rPr>
+          <w:rFonts w:ascii="Times New Roman" w:hAnsi="Times New Roman" w:cs="Times New Roman"/>
+          <w:sz w:val="24"/>
+        </w:rPr>
+        <w:t>Artifactory</w:t>
+      </w:r>
+      <w:proofErr w:type="spellEnd"/>
+      <w:r>
+        <w:rPr>
+          <w:rFonts w:ascii="Times New Roman" w:hAnsi="Times New Roman" w:cs="Times New Roman"/>
+          <w:sz w:val="24"/>
+        </w:rPr>
+        <w:t xml:space="preserve">, and </w:t>
+      </w:r>
+      <w:proofErr w:type="spellStart"/>
+      <w:r>
+        <w:rPr>
+          <w:rFonts w:ascii="Times New Roman" w:hAnsi="Times New Roman" w:cs="Times New Roman"/>
+          <w:sz w:val="24"/>
+        </w:rPr>
+        <w:t>SonarQube</w:t>
+      </w:r>
+      <w:proofErr w:type="spellEnd"/>
+      <w:r>
+        <w:rPr>
+          <w:rFonts w:ascii="Times New Roman" w:hAnsi="Times New Roman" w:cs="Times New Roman"/>
+          <w:sz w:val="24"/>
+        </w:rPr>
+        <w:t>. The pipeline automates code quality checks, testing, artifact management, and multi-environment deployments.</w:t>
+      </w:r>
+    </w:p>
+    <w:p>
+      <w:pPr>
         <w:rPr>
           <w:rFonts w:ascii="Times New Roman" w:hAnsi="Times New Roman" w:cs="Times New Roman"/>
           <w:b/>
           <w:bCs/>
           <w:sz w:val="24"/>
         </w:rPr>
-        <w:t>Munga</w:t>
-      </w:r>
-      <w:proofErr w:type="spellEnd"/>
-    </w:p>
-    <w:p>
-      <w:pPr>
+      </w:pPr>
+      <w:r>
         <w:rPr>
           <w:rFonts w:ascii="Times New Roman" w:hAnsi="Times New Roman" w:cs="Times New Roman"/>
           <w:b/>
           <w:bCs/>
           <w:sz w:val="24"/>
         </w:rPr>
-      </w:pPr>
-      <w:r>
+        <w:t>Key Features Implemented:</w:t>
+      </w:r>
+    </w:p>
+    <w:p>
+      <w:pPr>
         <w:rPr>
           <w:rFonts w:ascii="Times New Roman" w:hAnsi="Times New Roman" w:cs="Times New Roman"/>
           <w:b/>
           <w:bCs/>
           <w:sz w:val="24"/>
         </w:rPr>
-        <w:t>Date: 12/11/2025</w:t>
-      </w:r>
-    </w:p>
-    <w:p>
-      <w:pPr>
+      </w:pPr>
+      <w:r>
         <w:rPr>
           <w:rFonts w:ascii="Times New Roman" w:hAnsi="Times New Roman" w:cs="Times New Roman"/>
           <w:b/>
           <w:bCs/>
           <w:sz w:val="24"/>
         </w:rPr>
-      </w:pPr>
-      <w:r>
+        <w:t>1. Infrastructure Setup:</w:t>
+      </w:r>
+    </w:p>
+    <w:p>
+      <w:pPr>
+        <w:numPr>
+          <w:ilvl w:val="0"/>
+          <w:numId w:val="8"/>
+        </w:numPr>
+        <w:rPr>
+          <w:rFonts w:ascii="Times New Roman" w:hAnsi="Times New Roman" w:cs="Times New Roman"/>
+          <w:sz w:val="24"/>
+        </w:rPr>
+      </w:pPr>
+      <w:r>
+        <w:rPr>
+          <w:rFonts w:ascii="Times New Roman" w:hAnsi="Times New Roman" w:cs="Times New Roman"/>
+          <w:sz w:val="24"/>
+        </w:rPr>
+        <w:t xml:space="preserve"> Jenkins server with Blue Ocean interface</w:t>
+      </w:r>
+    </w:p>
+    <w:p>
+      <w:pPr>
+        <w:numPr>
+          <w:ilvl w:val="0"/>
+          <w:numId w:val="8"/>
+        </w:numPr>
+        <w:rPr>
+          <w:rFonts w:ascii="Times New Roman" w:hAnsi="Times New Roman" w:cs="Times New Roman"/>
+          <w:sz w:val="24"/>
+        </w:rPr>
+      </w:pPr>
+      <w:r>
+        <w:rPr>
+          <w:rFonts w:ascii="Times New Roman" w:hAnsi="Times New Roman" w:cs="Times New Roman"/>
+          <w:sz w:val="24"/>
+        </w:rPr>
+        <w:t xml:space="preserve"> </w:t>
+      </w:r>
+      <w:proofErr w:type="spellStart"/>
+      <w:r>
+        <w:rPr>
+          <w:rFonts w:ascii="Times New Roman" w:hAnsi="Times New Roman" w:cs="Times New Roman"/>
+          <w:sz w:val="24"/>
+        </w:rPr>
+        <w:t>SonarQube</w:t>
+      </w:r>
+      <w:proofErr w:type="spellEnd"/>
+      <w:r>
+        <w:rPr>
+          <w:rFonts w:ascii="Times New Roman" w:hAnsi="Times New Roman" w:cs="Times New Roman"/>
+          <w:sz w:val="24"/>
+        </w:rPr>
+        <w:t xml:space="preserve"> for code quality analysis</w:t>
+      </w:r>
+    </w:p>
+    <w:p>
+      <w:pPr>
+        <w:numPr>
+          <w:ilvl w:val="0"/>
+          <w:numId w:val="8"/>
+        </w:numPr>
+        <w:rPr>
+          <w:rFonts w:ascii="Times New Roman" w:hAnsi="Times New Roman" w:cs="Times New Roman"/>
+          <w:sz w:val="24"/>
+        </w:rPr>
+      </w:pPr>
+      <w:r>
+        <w:rPr>
+          <w:rFonts w:ascii="Times New Roman" w:hAnsi="Times New Roman" w:cs="Times New Roman"/>
+          <w:sz w:val="24"/>
+        </w:rPr>
+        <w:t xml:space="preserve"> </w:t>
+      </w:r>
+      <w:proofErr w:type="spellStart"/>
+      <w:r>
+        <w:rPr>
+          <w:rFonts w:ascii="Times New Roman" w:hAnsi="Times New Roman" w:cs="Times New Roman"/>
+          <w:sz w:val="24"/>
+        </w:rPr>
+        <w:t>JFrog</w:t>
+      </w:r>
+      <w:proofErr w:type="spellEnd"/>
+      <w:r>
+        <w:rPr>
+          <w:rFonts w:ascii="Times New Roman" w:hAnsi="Times New Roman" w:cs="Times New Roman"/>
+          <w:sz w:val="24"/>
+        </w:rPr>
+        <w:t xml:space="preserve"> </w:t>
+      </w:r>
+      <w:proofErr w:type="spellStart"/>
+      <w:r>
+        <w:rPr>
+          <w:rFonts w:ascii="Times New Roman" w:hAnsi="Times New Roman" w:cs="Times New Roman"/>
+          <w:sz w:val="24"/>
+        </w:rPr>
+        <w:t>Artifactory</w:t>
+      </w:r>
+      <w:proofErr w:type="spellEnd"/>
+      <w:r>
+        <w:rPr>
+          <w:rFonts w:ascii="Times New Roman" w:hAnsi="Times New Roman" w:cs="Times New Roman"/>
+          <w:sz w:val="24"/>
+        </w:rPr>
+        <w:t xml:space="preserve"> for artifact management</w:t>
+      </w:r>
+    </w:p>
+    <w:p>
+      <w:pPr>
+        <w:numPr>
+          <w:ilvl w:val="0"/>
+          <w:numId w:val="8"/>
+        </w:numPr>
+        <w:rPr>
+          <w:rFonts w:ascii="Times New Roman" w:hAnsi="Times New Roman" w:cs="Times New Roman"/>
+          <w:sz w:val="24"/>
+        </w:rPr>
+      </w:pPr>
+      <w:r>
+        <w:rPr>
+          <w:rFonts w:ascii="Times New Roman" w:hAnsi="Times New Roman" w:cs="Times New Roman"/>
+          <w:sz w:val="24"/>
+        </w:rPr>
+        <w:t xml:space="preserve"> Multi-environment setup (Dev, SIT, Pentest)</w:t>
+      </w:r>
+    </w:p>
+    <w:p>
+      <w:pPr>
+        <w:numPr>
+          <w:ilvl w:val="0"/>
+          <w:numId w:val="8"/>
+        </w:numPr>
+        <w:rPr>
+          <w:rFonts w:ascii="Times New Roman" w:hAnsi="Times New Roman" w:cs="Times New Roman"/>
+          <w:sz w:val="24"/>
+        </w:rPr>
+      </w:pPr>
+      <w:r>
+        <w:rPr>
+          <w:rFonts w:ascii="Times New Roman" w:hAnsi="Times New Roman" w:cs="Times New Roman"/>
+          <w:sz w:val="24"/>
+        </w:rPr>
+        <w:t xml:space="preserve"> Nginx reverse proxy configuration</w:t>
+      </w:r>
+    </w:p>
+    <w:p>
+      <w:pPr>
         <w:rPr>
           <w:rFonts w:ascii="Times New Roman" w:hAnsi="Times New Roman" w:cs="Times New Roman"/>
           <w:b/>
           <w:bCs/>
           <w:sz w:val="24"/>
         </w:rPr>
-        <w:t>Project Overview</w:t>
-      </w:r>
-    </w:p>
-    <w:p>
-      <w:pPr>
-        <w:rPr>
-          <w:rFonts w:ascii="Times New Roman" w:hAnsi="Times New Roman" w:cs="Times New Roman"/>
-          <w:sz w:val="24"/>
-        </w:rPr>
-      </w:pPr>
-      <w:r>
-        <w:rPr>
-          <w:rFonts w:ascii="Times New Roman" w:hAnsi="Times New Roman" w:cs="Times New Roman"/>
-          <w:sz w:val="24"/>
-        </w:rPr>
-        <w:t>Implemented a complete end-to-end CI/CD pipeline for PHP-based applications (Tooling and TODO web apps) using modern DevOps tools. The pipeline automates building, testing, security scanning, quality gating, and deployment across multiple environments.</w:t>
-      </w:r>
-    </w:p>
-    <w:p>
-      <w:pPr>
+      </w:pPr>
+      <w:r>
         <w:rPr>
           <w:rFonts w:ascii="Times New Roman" w:hAnsi="Times New Roman" w:cs="Times New Roman"/>
           <w:b/>
           <w:bCs/>
           <w:sz w:val="24"/>
         </w:rPr>
-      </w:pPr>
-      <w:r>
+        <w:t>2. CI/CD Pipeline:</w:t>
+      </w:r>
+    </w:p>
+    <w:p>
+      <w:pPr>
+        <w:numPr>
+          <w:ilvl w:val="0"/>
+          <w:numId w:val="9"/>
+        </w:numPr>
+        <w:rPr>
+          <w:rFonts w:ascii="Times New Roman" w:hAnsi="Times New Roman" w:cs="Times New Roman"/>
+          <w:sz w:val="24"/>
+        </w:rPr>
+      </w:pPr>
+      <w:r>
+        <w:rPr>
+          <w:rFonts w:ascii="Times New Roman" w:hAnsi="Times New Roman" w:cs="Times New Roman"/>
+          <w:sz w:val="24"/>
+        </w:rPr>
+        <w:t xml:space="preserve"> Automated GitHub </w:t>
+      </w:r>
+      <w:proofErr w:type="spellStart"/>
+      <w:r>
+        <w:rPr>
+          <w:rFonts w:ascii="Times New Roman" w:hAnsi="Times New Roman" w:cs="Times New Roman"/>
+          <w:sz w:val="24"/>
+        </w:rPr>
+        <w:t>webhook</w:t>
+      </w:r>
+      <w:proofErr w:type="spellEnd"/>
+      <w:r>
+        <w:rPr>
+          <w:rFonts w:ascii="Times New Roman" w:hAnsi="Times New Roman" w:cs="Times New Roman"/>
+          <w:sz w:val="24"/>
+        </w:rPr>
+        <w:t xml:space="preserve"> triggers</w:t>
+      </w:r>
+    </w:p>
+    <w:p>
+      <w:pPr>
+        <w:numPr>
+          <w:ilvl w:val="0"/>
+          <w:numId w:val="9"/>
+        </w:numPr>
+        <w:rPr>
+          <w:rFonts w:ascii="Times New Roman" w:hAnsi="Times New Roman" w:cs="Times New Roman"/>
+          <w:sz w:val="24"/>
+        </w:rPr>
+      </w:pPr>
+      <w:r>
+        <w:rPr>
+          <w:rFonts w:ascii="Times New Roman" w:hAnsi="Times New Roman" w:cs="Times New Roman"/>
+          <w:sz w:val="24"/>
+        </w:rPr>
+        <w:t xml:space="preserve"> PHP unit test execution</w:t>
+      </w:r>
+    </w:p>
+    <w:p>
+      <w:pPr>
+        <w:numPr>
+          <w:ilvl w:val="0"/>
+          <w:numId w:val="9"/>
+        </w:numPr>
+        <w:rPr>
+          <w:rFonts w:ascii="Times New Roman" w:hAnsi="Times New Roman" w:cs="Times New Roman"/>
+          <w:sz w:val="24"/>
+        </w:rPr>
+      </w:pPr>
+      <w:r>
+        <w:rPr>
+          <w:rFonts w:ascii="Times New Roman" w:hAnsi="Times New Roman" w:cs="Times New Roman"/>
+          <w:sz w:val="24"/>
+        </w:rPr>
+        <w:t xml:space="preserve"> </w:t>
+      </w:r>
+      <w:proofErr w:type="spellStart"/>
+      <w:r>
+        <w:rPr>
+          <w:rFonts w:ascii="Times New Roman" w:hAnsi="Times New Roman" w:cs="Times New Roman"/>
+          <w:sz w:val="24"/>
+        </w:rPr>
+        <w:t>SonarQube</w:t>
+      </w:r>
+      <w:proofErr w:type="spellEnd"/>
+      <w:r>
+        <w:rPr>
+          <w:rFonts w:ascii="Times New Roman" w:hAnsi="Times New Roman" w:cs="Times New Roman"/>
+          <w:sz w:val="24"/>
+        </w:rPr>
+        <w:t xml:space="preserve"> quality gates integration</w:t>
+      </w:r>
+    </w:p>
+    <w:p>
+      <w:pPr>
+        <w:numPr>
+          <w:ilvl w:val="0"/>
+          <w:numId w:val="9"/>
+        </w:numPr>
+        <w:rPr>
+          <w:rFonts w:ascii="Times New Roman" w:hAnsi="Times New Roman" w:cs="Times New Roman"/>
+          <w:sz w:val="24"/>
+        </w:rPr>
+      </w:pPr>
+      <w:r>
+        <w:rPr>
+          <w:rFonts w:ascii="Times New Roman" w:hAnsi="Times New Roman" w:cs="Times New Roman"/>
+          <w:sz w:val="24"/>
+        </w:rPr>
+        <w:t xml:space="preserve"> Artifact versioning and storage</w:t>
+      </w:r>
+    </w:p>
+    <w:p>
+      <w:pPr>
+        <w:numPr>
+          <w:ilvl w:val="0"/>
+          <w:numId w:val="9"/>
+        </w:numPr>
+        <w:rPr>
+          <w:rFonts w:ascii="Times New Roman" w:hAnsi="Times New Roman" w:cs="Times New Roman"/>
+          <w:sz w:val="24"/>
+        </w:rPr>
+      </w:pPr>
+      <w:r>
+        <w:rPr>
+          <w:rFonts w:ascii="Times New Roman" w:hAnsi="Times New Roman" w:cs="Times New Roman"/>
+          <w:sz w:val="24"/>
+        </w:rPr>
+        <w:t xml:space="preserve"> </w:t>
+      </w:r>
+      <w:proofErr w:type="spellStart"/>
+      <w:r>
+        <w:rPr>
+          <w:rFonts w:ascii="Times New Roman" w:hAnsi="Times New Roman" w:cs="Times New Roman"/>
+          <w:sz w:val="24"/>
+        </w:rPr>
+        <w:t>Ansible</w:t>
+      </w:r>
+      <w:proofErr w:type="spellEnd"/>
+      <w:r>
+        <w:rPr>
+          <w:rFonts w:ascii="Times New Roman" w:hAnsi="Times New Roman" w:cs="Times New Roman"/>
+          <w:sz w:val="24"/>
+        </w:rPr>
+        <w:t>-based deployment automation</w:t>
+      </w:r>
+    </w:p>
+    <w:p>
+      <w:pPr>
+        <w:numPr>
+          <w:ilvl w:val="0"/>
+          <w:numId w:val="9"/>
+        </w:numPr>
+        <w:rPr>
+          <w:rFonts w:ascii="Times New Roman" w:hAnsi="Times New Roman" w:cs="Times New Roman"/>
+          <w:sz w:val="24"/>
+        </w:rPr>
+      </w:pPr>
+      <w:r>
+        <w:rPr>
+          <w:rFonts w:ascii="Times New Roman" w:hAnsi="Times New Roman" w:cs="Times New Roman"/>
+          <w:sz w:val="24"/>
+        </w:rPr>
+        <w:t xml:space="preserve"> Multi-branch pipeline support</w:t>
+      </w:r>
+    </w:p>
+    <w:p>
+      <w:pPr>
         <w:rPr>
           <w:rFonts w:ascii="Times New Roman" w:hAnsi="Times New Roman" w:cs="Times New Roman"/>
           <w:b/>
           <w:bCs/>
           <w:sz w:val="24"/>
         </w:rPr>
-        <w:t>Technical Stack</w:t>
+      </w:pPr>
+      <w:r>
+        <w:rPr>
+          <w:rFonts w:ascii="Times New Roman" w:hAnsi="Times New Roman" w:cs="Times New Roman"/>
+          <w:b/>
+          <w:bCs/>
+          <w:sz w:val="24"/>
+        </w:rPr>
+        <w:t xml:space="preserve">3. </w:t>
+      </w:r>
+      <w:proofErr w:type="spellStart"/>
+      <w:r>
+        <w:rPr>
+          <w:rFonts w:ascii="Times New Roman" w:hAnsi="Times New Roman" w:cs="Times New Roman"/>
+          <w:b/>
+          <w:bCs/>
+          <w:sz w:val="24"/>
+        </w:rPr>
+        <w:t>CodeQuality</w:t>
+      </w:r>
+      <w:proofErr w:type="spellEnd"/>
+      <w:r>
+        <w:rPr>
+          <w:rFonts w:ascii="Times New Roman" w:hAnsi="Times New Roman" w:cs="Times New Roman"/>
+          <w:b/>
+          <w:bCs/>
+          <w:sz w:val="24"/>
+        </w:rPr>
+        <w:t>:</w:t>
       </w:r>
     </w:p>
     <w:p>
       <w:pPr>
         <w:numPr>
           <w:ilvl w:val="0"/>
-          <w:numId w:val="1"/>
+          <w:numId w:val="10"/>
         </w:numPr>
         <w:rPr>
           <w:rFonts w:ascii="Times New Roman" w:hAnsi="Times New Roman" w:cs="Times New Roman"/>
@@ -135,27 +532,103 @@
         </w:rPr>
       </w:pPr>
       <w:r>
+        <w:rPr>
+          <w:rFonts w:ascii="Times New Roman" w:hAnsi="Times New Roman" w:cs="Times New Roman"/>
+          <w:sz w:val="24"/>
+        </w:rPr>
+        <w:t xml:space="preserve"> Static code analysis with </w:t>
+      </w:r>
+      <w:proofErr w:type="spellStart"/>
+      <w:r>
+        <w:rPr>
+          <w:rFonts w:ascii="Times New Roman" w:hAnsi="Times New Roman" w:cs="Times New Roman"/>
+          <w:sz w:val="24"/>
+        </w:rPr>
+        <w:t>SonarQube</w:t>
+      </w:r>
+      <w:proofErr w:type="spellEnd"/>
+    </w:p>
+    <w:p>
+      <w:pPr>
+        <w:numPr>
+          <w:ilvl w:val="0"/>
+          <w:numId w:val="10"/>
+        </w:numPr>
+        <w:rPr>
+          <w:rFonts w:ascii="Times New Roman" w:hAnsi="Times New Roman" w:cs="Times New Roman"/>
+          <w:sz w:val="24"/>
+        </w:rPr>
+      </w:pPr>
+      <w:r>
+        <w:rPr>
+          <w:rFonts w:ascii="Times New Roman" w:hAnsi="Times New Roman" w:cs="Times New Roman"/>
+          <w:sz w:val="24"/>
+        </w:rPr>
+        <w:t xml:space="preserve"> Code coverage reporting</w:t>
+      </w:r>
+    </w:p>
+    <w:p>
+      <w:pPr>
+        <w:numPr>
+          <w:ilvl w:val="0"/>
+          <w:numId w:val="10"/>
+        </w:numPr>
+        <w:rPr>
+          <w:rFonts w:ascii="Times New Roman" w:hAnsi="Times New Roman" w:cs="Times New Roman"/>
+          <w:sz w:val="24"/>
+        </w:rPr>
+      </w:pPr>
+      <w:r>
+        <w:rPr>
+          <w:rFonts w:ascii="Times New Roman" w:hAnsi="Times New Roman" w:cs="Times New Roman"/>
+          <w:sz w:val="24"/>
+        </w:rPr>
+        <w:t xml:space="preserve"> Quality gate enforcement</w:t>
+      </w:r>
+    </w:p>
+    <w:p>
+      <w:pPr>
+        <w:numPr>
+          <w:ilvl w:val="0"/>
+          <w:numId w:val="10"/>
+        </w:numPr>
+        <w:rPr>
+          <w:rFonts w:ascii="Times New Roman" w:hAnsi="Times New Roman" w:cs="Times New Roman"/>
+          <w:sz w:val="24"/>
+        </w:rPr>
+      </w:pPr>
+      <w:r>
+        <w:rPr>
+          <w:rFonts w:ascii="Times New Roman" w:hAnsi="Times New Roman" w:cs="Times New Roman"/>
+          <w:sz w:val="24"/>
+        </w:rPr>
+        <w:t xml:space="preserve"> Plot visualization of metrics</w:t>
+      </w:r>
+    </w:p>
+    <w:p>
+      <w:pPr>
         <w:rPr>
           <w:rFonts w:ascii="Times New Roman" w:hAnsi="Times New Roman" w:cs="Times New Roman"/>
           <w:b/>
           <w:bCs/>
           <w:sz w:val="24"/>
         </w:rPr>
-        <w:t>Orchestration</w:t>
-      </w:r>
-      <w:r>
-        <w:rPr>
-          <w:rFonts w:ascii="Times New Roman" w:hAnsi="Times New Roman" w:cs="Times New Roman"/>
-          <w:sz w:val="24"/>
-        </w:rPr>
-        <w:t>: Jenkins</w:t>
+      </w:pPr>
+      <w:r>
+        <w:rPr>
+          <w:rFonts w:ascii="Times New Roman" w:hAnsi="Times New Roman" w:cs="Times New Roman"/>
+          <w:b/>
+          <w:bCs/>
+          <w:sz w:val="24"/>
+        </w:rPr>
+        <w:t>4. Deployment Automation:</w:t>
       </w:r>
     </w:p>
     <w:p>
       <w:pPr>
         <w:numPr>
           <w:ilvl w:val="0"/>
-          <w:numId w:val="1"/>
+          <w:numId w:val="11"/>
         </w:numPr>
         <w:rPr>
           <w:rFonts w:ascii="Times New Roman" w:hAnsi="Times New Roman" w:cs="Times New Roman"/>
@@ -163,36 +636,104 @@
         </w:rPr>
       </w:pPr>
       <w:r>
+        <w:rPr>
+          <w:rFonts w:ascii="Times New Roman" w:hAnsi="Times New Roman" w:cs="Times New Roman"/>
+          <w:sz w:val="24"/>
+        </w:rPr>
+        <w:t xml:space="preserve"> Infrastructure as Code with </w:t>
+      </w:r>
+      <w:proofErr w:type="spellStart"/>
+      <w:r>
+        <w:rPr>
+          <w:rFonts w:ascii="Times New Roman" w:hAnsi="Times New Roman" w:cs="Times New Roman"/>
+          <w:sz w:val="24"/>
+        </w:rPr>
+        <w:t>Ansible</w:t>
+      </w:r>
+      <w:proofErr w:type="spellEnd"/>
+    </w:p>
+    <w:p>
+      <w:pPr>
+        <w:numPr>
+          <w:ilvl w:val="0"/>
+          <w:numId w:val="11"/>
+        </w:numPr>
+        <w:rPr>
+          <w:rFonts w:ascii="Times New Roman" w:hAnsi="Times New Roman" w:cs="Times New Roman"/>
+          <w:sz w:val="24"/>
+        </w:rPr>
+      </w:pPr>
+      <w:r>
+        <w:rPr>
+          <w:rFonts w:ascii="Times New Roman" w:hAnsi="Times New Roman" w:cs="Times New Roman"/>
+          <w:sz w:val="24"/>
+        </w:rPr>
+        <w:t xml:space="preserve"> Environment-specific configurations</w:t>
+      </w:r>
+    </w:p>
+    <w:p>
+      <w:pPr>
+        <w:numPr>
+          <w:ilvl w:val="0"/>
+          <w:numId w:val="11"/>
+        </w:numPr>
+        <w:rPr>
+          <w:rFonts w:ascii="Times New Roman" w:hAnsi="Times New Roman" w:cs="Times New Roman"/>
+          <w:sz w:val="24"/>
+        </w:rPr>
+      </w:pPr>
+      <w:r>
+        <w:rPr>
+          <w:rFonts w:ascii="Times New Roman" w:hAnsi="Times New Roman" w:cs="Times New Roman"/>
+          <w:sz w:val="24"/>
+        </w:rPr>
+        <w:t xml:space="preserve"> Database migration automation</w:t>
+      </w:r>
+    </w:p>
+    <w:p>
+      <w:pPr>
+        <w:numPr>
+          <w:ilvl w:val="0"/>
+          <w:numId w:val="11"/>
+        </w:numPr>
+        <w:rPr>
+          <w:rFonts w:ascii="Times New Roman" w:hAnsi="Times New Roman" w:cs="Times New Roman"/>
+          <w:sz w:val="24"/>
+        </w:rPr>
+      </w:pPr>
+      <w:r>
+        <w:rPr>
+          <w:rFonts w:ascii="Times New Roman" w:hAnsi="Times New Roman" w:cs="Times New Roman"/>
+          <w:sz w:val="24"/>
+        </w:rPr>
+        <w:lastRenderedPageBreak/>
+        <w:t xml:space="preserve"> Zero-downtime deployment approach</w:t>
+      </w:r>
+    </w:p>
+    <w:p>
+      <w:pPr>
         <w:rPr>
           <w:rFonts w:ascii="Times New Roman" w:hAnsi="Times New Roman" w:cs="Times New Roman"/>
           <w:b/>
           <w:bCs/>
           <w:sz w:val="24"/>
         </w:rPr>
-        <w:t>Configuration Management</w:t>
-      </w:r>
-      <w:r>
-        <w:rPr>
-          <w:rFonts w:ascii="Times New Roman" w:hAnsi="Times New Roman" w:cs="Times New Roman"/>
-          <w:sz w:val="24"/>
-        </w:rPr>
-        <w:t xml:space="preserve">: </w:t>
-      </w:r>
-      <w:proofErr w:type="spellStart"/>
-      <w:r>
-        <w:rPr>
-          <w:rFonts w:ascii="Times New Roman" w:hAnsi="Times New Roman" w:cs="Times New Roman"/>
-          <w:sz w:val="24"/>
-        </w:rPr>
-        <w:t>Ansible</w:t>
-      </w:r>
-      <w:proofErr w:type="spellEnd"/>
+      </w:pPr>
+      <w:r>
+        <w:rPr>
+          <w:rFonts w:ascii="Times New Roman" w:hAnsi="Times New Roman" w:cs="Times New Roman"/>
+          <w:b/>
+          <w:bCs/>
+          <w:sz w:val="24"/>
+        </w:rPr>
+        <w:t>Technologies Used:</w:t>
+      </w:r>
     </w:p>
     <w:p>
       <w:pPr>
         <w:numPr>
           <w:ilvl w:val="0"/>
-          <w:numId w:val="1"/>
+          <w:numId w:val="13"/>
         </w:numPr>
         <w:rPr>
           <w:rFonts w:ascii="Times New Roman" w:hAnsi="Times New Roman" w:cs="Times New Roman"/>
@@ -206,14 +747,14 @@
           <w:bCs/>
           <w:sz w:val="24"/>
         </w:rPr>
-        <w:t>Code Quality</w:t>
-      </w:r>
-      <w:r>
-        <w:rPr>
-          <w:rFonts w:ascii="Times New Roman" w:hAnsi="Times New Roman" w:cs="Times New Roman"/>
-          <w:sz w:val="24"/>
-        </w:rPr>
-        <w:t xml:space="preserve">: </w:t>
+        <w:t>CI/CD:</w:t>
+      </w:r>
+      <w:r>
+        <w:rPr>
+          <w:rFonts w:ascii="Times New Roman" w:hAnsi="Times New Roman" w:cs="Times New Roman"/>
+          <w:sz w:val="24"/>
+        </w:rPr>
+        <w:t xml:space="preserve"> Jenkins, Blue Ocean, GitHub </w:t>
       </w:r>
       <w:proofErr w:type="spellStart"/>
       <w:r>
@@ -221,22 +762,15 @@
           <w:rFonts w:ascii="Times New Roman" w:hAnsi="Times New Roman" w:cs="Times New Roman"/>
           <w:sz w:val="24"/>
         </w:rPr>
-        <w:t>SonarQube</w:t>
+        <w:t>Webhooks</w:t>
       </w:r>
       <w:proofErr w:type="spellEnd"/>
-      <w:r>
-        <w:rPr>
-          <w:rFonts w:ascii="Times New Roman" w:hAnsi="Times New Roman" w:cs="Times New Roman"/>
-          <w:sz w:val="24"/>
-        </w:rPr>
-        <w:t xml:space="preserve"> 7.9.3</w:t>
-      </w:r>
     </w:p>
     <w:p>
       <w:pPr>
         <w:numPr>
           <w:ilvl w:val="0"/>
-          <w:numId w:val="1"/>
+          <w:numId w:val="13"/>
         </w:numPr>
         <w:rPr>
           <w:rFonts w:ascii="Times New Roman" w:hAnsi="Times New Roman" w:cs="Times New Roman"/>
@@ -250,14 +784,14 @@
           <w:bCs/>
           <w:sz w:val="24"/>
         </w:rPr>
-        <w:t>Artifact Repository</w:t>
-      </w:r>
-      <w:r>
-        <w:rPr>
-          <w:rFonts w:ascii="Times New Roman" w:hAnsi="Times New Roman" w:cs="Times New Roman"/>
-          <w:sz w:val="24"/>
-        </w:rPr>
-        <w:t xml:space="preserve">: </w:t>
+        <w:t>Code Quality:</w:t>
+      </w:r>
+      <w:r>
+        <w:rPr>
+          <w:rFonts w:ascii="Times New Roman" w:hAnsi="Times New Roman" w:cs="Times New Roman"/>
+          <w:sz w:val="24"/>
+        </w:rPr>
+        <w:t> </w:t>
       </w:r>
       <w:proofErr w:type="spellStart"/>
       <w:r>
@@ -265,15 +799,38 @@
           <w:rFonts w:ascii="Times New Roman" w:hAnsi="Times New Roman" w:cs="Times New Roman"/>
           <w:sz w:val="24"/>
         </w:rPr>
-        <w:t>Artifactory</w:t>
+        <w:t>SonarQube</w:t>
       </w:r>
       <w:proofErr w:type="spellEnd"/>
+      <w:r>
+        <w:rPr>
+          <w:rFonts w:ascii="Times New Roman" w:hAnsi="Times New Roman" w:cs="Times New Roman"/>
+          <w:sz w:val="24"/>
+        </w:rPr>
+        <w:t xml:space="preserve">, </w:t>
+      </w:r>
+      <w:proofErr w:type="spellStart"/>
+      <w:r>
+        <w:rPr>
+          <w:rFonts w:ascii="Times New Roman" w:hAnsi="Times New Roman" w:cs="Times New Roman"/>
+          <w:sz w:val="24"/>
+        </w:rPr>
+        <w:t>PHPUnit</w:t>
+      </w:r>
+      <w:proofErr w:type="spellEnd"/>
+      <w:r>
+        <w:rPr>
+          <w:rFonts w:ascii="Times New Roman" w:hAnsi="Times New Roman" w:cs="Times New Roman"/>
+          <w:sz w:val="24"/>
+        </w:rPr>
+        <w:t>, PHPLOC</w:t>
+      </w:r>
     </w:p>
     <w:p>
       <w:pPr>
         <w:numPr>
           <w:ilvl w:val="0"/>
-          <w:numId w:val="1"/>
+          <w:numId w:val="13"/>
         </w:numPr>
         <w:rPr>
           <w:rFonts w:ascii="Times New Roman" w:hAnsi="Times New Roman" w:cs="Times New Roman"/>
@@ -287,21 +844,46 @@
           <w:bCs/>
           <w:sz w:val="24"/>
         </w:rPr>
-        <w:t>Reverse Proxy</w:t>
-      </w:r>
-      <w:r>
-        <w:rPr>
-          <w:rFonts w:ascii="Times New Roman" w:hAnsi="Times New Roman" w:cs="Times New Roman"/>
-          <w:sz w:val="24"/>
-        </w:rPr>
-        <w:t>: Nginx</w:t>
-      </w:r>
+        <w:t>Artifact Management:</w:t>
+      </w:r>
+      <w:r>
+        <w:rPr>
+          <w:rFonts w:ascii="Times New Roman" w:hAnsi="Times New Roman" w:cs="Times New Roman"/>
+          <w:sz w:val="24"/>
+        </w:rPr>
+        <w:t> </w:t>
+      </w:r>
+      <w:proofErr w:type="spellStart"/>
+      <w:r>
+        <w:rPr>
+          <w:rFonts w:ascii="Times New Roman" w:hAnsi="Times New Roman" w:cs="Times New Roman"/>
+          <w:sz w:val="24"/>
+        </w:rPr>
+        <w:t>JFrog</w:t>
+      </w:r>
+      <w:proofErr w:type="spellEnd"/>
+      <w:r>
+        <w:rPr>
+          <w:rFonts w:ascii="Times New Roman" w:hAnsi="Times New Roman" w:cs="Times New Roman"/>
+          <w:sz w:val="24"/>
+        </w:rPr>
+        <w:t xml:space="preserve"> </w:t>
+      </w:r>
+      <w:proofErr w:type="spellStart"/>
+      <w:r>
+        <w:rPr>
+          <w:rFonts w:ascii="Times New Roman" w:hAnsi="Times New Roman" w:cs="Times New Roman"/>
+          <w:sz w:val="24"/>
+        </w:rPr>
+        <w:t>Artifactory</w:t>
+      </w:r>
+      <w:proofErr w:type="spellEnd"/>
     </w:p>
     <w:p>
       <w:pPr>
         <w:numPr>
           <w:ilvl w:val="0"/>
-          <w:numId w:val="1"/>
+          <w:numId w:val="13"/>
         </w:numPr>
         <w:rPr>
           <w:rFonts w:ascii="Times New Roman" w:hAnsi="Times New Roman" w:cs="Times New Roman"/>
@@ -315,14 +897,14 @@
           <w:bCs/>
           <w:sz w:val="24"/>
         </w:rPr>
-        <w:t>Database</w:t>
-      </w:r>
-      <w:r>
-        <w:rPr>
-          <w:rFonts w:ascii="Times New Roman" w:hAnsi="Times New Roman" w:cs="Times New Roman"/>
-          <w:sz w:val="24"/>
-        </w:rPr>
-        <w:t>: PostgreSQL (</w:t>
+        <w:t>Configuration Management:</w:t>
+      </w:r>
+      <w:r>
+        <w:rPr>
+          <w:rFonts w:ascii="Times New Roman" w:hAnsi="Times New Roman" w:cs="Times New Roman"/>
+          <w:sz w:val="24"/>
+        </w:rPr>
+        <w:t> </w:t>
       </w:r>
       <w:proofErr w:type="spellStart"/>
       <w:r>
@@ -330,22 +912,15 @@
           <w:rFonts w:ascii="Times New Roman" w:hAnsi="Times New Roman" w:cs="Times New Roman"/>
           <w:sz w:val="24"/>
         </w:rPr>
-        <w:t>SonarQube</w:t>
+        <w:t>Ansible</w:t>
       </w:r>
       <w:proofErr w:type="spellEnd"/>
-      <w:r>
-        <w:rPr>
-          <w:rFonts w:ascii="Times New Roman" w:hAnsi="Times New Roman" w:cs="Times New Roman"/>
-          <w:sz w:val="24"/>
-        </w:rPr>
-        <w:t>), MySQL (Applications)</w:t>
-      </w:r>
     </w:p>
     <w:p>
       <w:pPr>
         <w:numPr>
           <w:ilvl w:val="0"/>
-          <w:numId w:val="1"/>
+          <w:numId w:val="13"/>
         </w:numPr>
         <w:rPr>
           <w:rFonts w:ascii="Times New Roman" w:hAnsi="Times New Roman" w:cs="Times New Roman"/>
@@ -359,40 +934,54 @@
           <w:bCs/>
           <w:sz w:val="24"/>
         </w:rPr>
-        <w:t>Languages</w:t>
-      </w:r>
-      <w:r>
-        <w:rPr>
-          <w:rFonts w:ascii="Times New Roman" w:hAnsi="Times New Roman" w:cs="Times New Roman"/>
-          <w:sz w:val="24"/>
-        </w:rPr>
-        <w:t>: PHP, Python, Groovy (</w:t>
-      </w:r>
-      <w:proofErr w:type="spellStart"/>
-      <w:r>
-        <w:rPr>
-          <w:rFonts w:ascii="Times New Roman" w:hAnsi="Times New Roman" w:cs="Times New Roman"/>
-          <w:sz w:val="24"/>
-        </w:rPr>
-        <w:t>Jenkinsfile</w:t>
-      </w:r>
-      <w:proofErr w:type="spellEnd"/>
-      <w:r>
-        <w:rPr>
-          <w:rFonts w:ascii="Times New Roman" w:hAnsi="Times New Roman" w:cs="Times New Roman"/>
-          <w:sz w:val="24"/>
-        </w:rPr>
-        <w:t>)</w:t>
-      </w:r>
-    </w:p>
-    <w:p>
-      <w:pPr>
+        <w:t>Infrastructure:</w:t>
+      </w:r>
+      <w:r>
+        <w:rPr>
+          <w:rFonts w:ascii="Times New Roman" w:hAnsi="Times New Roman" w:cs="Times New Roman"/>
+          <w:sz w:val="24"/>
+        </w:rPr>
+        <w:t> AWS EC2, Ubuntu 20.04</w:t>
+      </w:r>
+    </w:p>
+    <w:p>
+      <w:pPr>
+        <w:numPr>
+          <w:ilvl w:val="0"/>
+          <w:numId w:val="13"/>
+        </w:numPr>
+        <w:rPr>
+          <w:rFonts w:ascii="Times New Roman" w:hAnsi="Times New Roman" w:cs="Times New Roman"/>
+          <w:sz w:val="24"/>
+        </w:rPr>
+      </w:pPr>
+      <w:r>
         <w:rPr>
           <w:rFonts w:ascii="Times New Roman" w:hAnsi="Times New Roman" w:cs="Times New Roman"/>
           <w:b/>
           <w:bCs/>
           <w:sz w:val="24"/>
         </w:rPr>
+        <w:t>Web Servers:</w:t>
+      </w:r>
+      <w:r>
+        <w:rPr>
+          <w:rFonts w:ascii="Times New Roman" w:hAnsi="Times New Roman" w:cs="Times New Roman"/>
+          <w:sz w:val="24"/>
+        </w:rPr>
+        <w:t> Nginx, PHP-FPM</w:t>
+      </w:r>
+    </w:p>
+    <w:p>
+      <w:pPr>
+        <w:numPr>
+          <w:ilvl w:val="0"/>
+          <w:numId w:val="13"/>
+        </w:numPr>
+        <w:rPr>
+          <w:rFonts w:ascii="Times New Roman" w:hAnsi="Times New Roman" w:cs="Times New Roman"/>
+          <w:sz w:val="24"/>
+        </w:rPr>
       </w:pPr>
       <w:r>
         <w:rPr>
@@ -401,33 +990,68 @@
           <w:bCs/>
           <w:sz w:val="24"/>
         </w:rPr>
-        <w:t>Key Features Implemented</w:t>
-      </w:r>
-    </w:p>
-    <w:p>
-      <w:pPr>
+        <w:t>Database:</w:t>
+      </w:r>
+      <w:r>
+        <w:rPr>
+          <w:rFonts w:ascii="Times New Roman" w:hAnsi="Times New Roman" w:cs="Times New Roman"/>
+          <w:sz w:val="24"/>
+        </w:rPr>
+        <w:t> MySQL</w:t>
+      </w:r>
+    </w:p>
+    <w:p>
+      <w:pPr>
+        <w:numPr>
+          <w:ilvl w:val="0"/>
+          <w:numId w:val="13"/>
+        </w:numPr>
+        <w:rPr>
+          <w:rFonts w:ascii="Times New Roman" w:hAnsi="Times New Roman" w:cs="Times New Roman"/>
+          <w:sz w:val="24"/>
+        </w:rPr>
+      </w:pPr>
+      <w:r>
         <w:rPr>
           <w:rFonts w:ascii="Times New Roman" w:hAnsi="Times New Roman" w:cs="Times New Roman"/>
           <w:b/>
           <w:bCs/>
           <w:sz w:val="24"/>
         </w:rPr>
-      </w:pPr>
-      <w:r>
+        <w:t>Monitoring:</w:t>
+      </w:r>
+      <w:r>
+        <w:rPr>
+          <w:rFonts w:ascii="Times New Roman" w:hAnsi="Times New Roman" w:cs="Times New Roman"/>
+          <w:sz w:val="24"/>
+        </w:rPr>
+        <w:t> Nginx logs, Jenkins monitoring</w:t>
+      </w:r>
+    </w:p>
+    <w:p>
+      <w:pPr>
         <w:rPr>
           <w:rFonts w:ascii="Times New Roman" w:hAnsi="Times New Roman" w:cs="Times New Roman"/>
           <w:b/>
           <w:bCs/>
           <w:sz w:val="24"/>
         </w:rPr>
-        <w:t>1. Multi-Stage Jenkins Pipeline</w:t>
+      </w:pPr>
+      <w:r>
+        <w:rPr>
+          <w:rFonts w:ascii="Times New Roman" w:hAnsi="Times New Roman" w:cs="Times New Roman"/>
+          <w:b/>
+          <w:bCs/>
+          <w:sz w:val="24"/>
+        </w:rPr>
+        <w:t>Challenges Overcome:</w:t>
       </w:r>
     </w:p>
     <w:p>
       <w:pPr>
         <w:numPr>
           <w:ilvl w:val="0"/>
-          <w:numId w:val="2"/>
+          <w:numId w:val="14"/>
         </w:numPr>
         <w:rPr>
           <w:rFonts w:ascii="Times New Roman" w:hAnsi="Times New Roman" w:cs="Times New Roman"/>
@@ -437,16 +1061,50 @@
       <w:r>
         <w:rPr>
           <w:rFonts w:ascii="Times New Roman" w:hAnsi="Times New Roman" w:cs="Times New Roman"/>
-          <w:sz w:val="24"/>
-        </w:rPr>
-        <w:t>Automated code checkout and dependency management</w:t>
-      </w:r>
+          <w:b/>
+          <w:bCs/>
+          <w:sz w:val="24"/>
+        </w:rPr>
+        <w:t>Multi-tool integration</w:t>
+      </w:r>
+      <w:r>
+        <w:rPr>
+          <w:rFonts w:ascii="Times New Roman" w:hAnsi="Times New Roman" w:cs="Times New Roman"/>
+          <w:sz w:val="24"/>
+        </w:rPr>
+        <w:t xml:space="preserve"> between Jenkins, </w:t>
+      </w:r>
+      <w:proofErr w:type="spellStart"/>
+      <w:r>
+        <w:rPr>
+          <w:rFonts w:ascii="Times New Roman" w:hAnsi="Times New Roman" w:cs="Times New Roman"/>
+          <w:sz w:val="24"/>
+        </w:rPr>
+        <w:t>SonarQube</w:t>
+      </w:r>
+      <w:proofErr w:type="spellEnd"/>
+      <w:r>
+        <w:rPr>
+          <w:rFonts w:ascii="Times New Roman" w:hAnsi="Times New Roman" w:cs="Times New Roman"/>
+          <w:sz w:val="24"/>
+        </w:rPr>
+        <w:t xml:space="preserve">, and </w:t>
+      </w:r>
+      <w:proofErr w:type="spellStart"/>
+      <w:r>
+        <w:rPr>
+          <w:rFonts w:ascii="Times New Roman" w:hAnsi="Times New Roman" w:cs="Times New Roman"/>
+          <w:sz w:val="24"/>
+        </w:rPr>
+        <w:t>Artifactory</w:t>
+      </w:r>
+      <w:proofErr w:type="spellEnd"/>
     </w:p>
     <w:p>
       <w:pPr>
         <w:numPr>
           <w:ilvl w:val="0"/>
-          <w:numId w:val="2"/>
+          <w:numId w:val="14"/>
         </w:numPr>
         <w:rPr>
           <w:rFonts w:ascii="Times New Roman" w:hAnsi="Times New Roman" w:cs="Times New Roman"/>
@@ -456,9 +1114,18 @@
       <w:r>
         <w:rPr>
           <w:rFonts w:ascii="Times New Roman" w:hAnsi="Times New Roman" w:cs="Times New Roman"/>
-          <w:sz w:val="24"/>
-        </w:rPr>
-        <w:t xml:space="preserve">Unit testing with </w:t>
+          <w:b/>
+          <w:bCs/>
+          <w:sz w:val="24"/>
+        </w:rPr>
+        <w:t>Environment-specific deployments</w:t>
+      </w:r>
+      <w:r>
+        <w:rPr>
+          <w:rFonts w:ascii="Times New Roman" w:hAnsi="Times New Roman" w:cs="Times New Roman"/>
+          <w:sz w:val="24"/>
+        </w:rPr>
+        <w:t xml:space="preserve"> with </w:t>
       </w:r>
       <w:proofErr w:type="spellStart"/>
       <w:r>
@@ -466,15 +1133,22 @@
           <w:rFonts w:ascii="Times New Roman" w:hAnsi="Times New Roman" w:cs="Times New Roman"/>
           <w:sz w:val="24"/>
         </w:rPr>
-        <w:t>PHPUnit</w:t>
+        <w:t>Ansible</w:t>
       </w:r>
       <w:proofErr w:type="spellEnd"/>
+      <w:r>
+        <w:rPr>
+          <w:rFonts w:ascii="Times New Roman" w:hAnsi="Times New Roman" w:cs="Times New Roman"/>
+          <w:sz w:val="24"/>
+        </w:rPr>
+        <w:t xml:space="preserve"> inventories</w:t>
+      </w:r>
     </w:p>
     <w:p>
       <w:pPr>
         <w:numPr>
           <w:ilvl w:val="0"/>
-          <w:numId w:val="2"/>
+          <w:numId w:val="14"/>
         </w:numPr>
         <w:rPr>
           <w:rFonts w:ascii="Times New Roman" w:hAnsi="Times New Roman" w:cs="Times New Roman"/>
@@ -484,25 +1158,25 @@
       <w:r>
         <w:rPr>
           <w:rFonts w:ascii="Times New Roman" w:hAnsi="Times New Roman" w:cs="Times New Roman"/>
-          <w:sz w:val="24"/>
-        </w:rPr>
-        <w:t xml:space="preserve">Code analysis using </w:t>
-      </w:r>
-      <w:proofErr w:type="spellStart"/>
-      <w:r>
-        <w:rPr>
-          <w:rFonts w:ascii="Times New Roman" w:hAnsi="Times New Roman" w:cs="Times New Roman"/>
-          <w:sz w:val="24"/>
-        </w:rPr>
-        <w:t>phploc</w:t>
-      </w:r>
-      <w:proofErr w:type="spellEnd"/>
+          <w:b/>
+          <w:bCs/>
+          <w:sz w:val="24"/>
+        </w:rPr>
+        <w:t>Quality gate implementation</w:t>
+      </w:r>
+      <w:r>
+        <w:rPr>
+          <w:rFonts w:ascii="Times New Roman" w:hAnsi="Times New Roman" w:cs="Times New Roman"/>
+          <w:sz w:val="24"/>
+        </w:rPr>
+        <w:t> to enforce code standards</w:t>
+      </w:r>
     </w:p>
     <w:p>
       <w:pPr>
         <w:numPr>
           <w:ilvl w:val="0"/>
-          <w:numId w:val="2"/>
+          <w:numId w:val="14"/>
         </w:numPr>
         <w:rPr>
           <w:rFonts w:ascii="Times New Roman" w:hAnsi="Times New Roman" w:cs="Times New Roman"/>
@@ -512,25 +1186,25 @@
       <w:r>
         <w:rPr>
           <w:rFonts w:ascii="Times New Roman" w:hAnsi="Times New Roman" w:cs="Times New Roman"/>
-          <w:sz w:val="24"/>
-        </w:rPr>
-        <w:t xml:space="preserve">Quality gates with </w:t>
-      </w:r>
-      <w:proofErr w:type="spellStart"/>
-      <w:r>
-        <w:rPr>
-          <w:rFonts w:ascii="Times New Roman" w:hAnsi="Times New Roman" w:cs="Times New Roman"/>
-          <w:sz w:val="24"/>
-        </w:rPr>
-        <w:t>SonarQube</w:t>
-      </w:r>
-      <w:proofErr w:type="spellEnd"/>
+          <w:b/>
+          <w:bCs/>
+          <w:sz w:val="24"/>
+        </w:rPr>
+        <w:t>SSH key management</w:t>
+      </w:r>
+      <w:r>
+        <w:rPr>
+          <w:rFonts w:ascii="Times New Roman" w:hAnsi="Times New Roman" w:cs="Times New Roman"/>
+          <w:sz w:val="24"/>
+        </w:rPr>
+        <w:t> for secure Jenkins-to-server communication</w:t>
+      </w:r>
     </w:p>
     <w:p>
       <w:pPr>
         <w:numPr>
           <w:ilvl w:val="0"/>
-          <w:numId w:val="2"/>
+          <w:numId w:val="14"/>
         </w:numPr>
         <w:rPr>
           <w:rFonts w:ascii="Times New Roman" w:hAnsi="Times New Roman" w:cs="Times New Roman"/>
@@ -538,846 +1212,21 @@
         </w:rPr>
       </w:pPr>
       <w:r>
-        <w:rPr>
-          <w:rFonts w:ascii="Times New Roman" w:hAnsi="Times New Roman" w:cs="Times New Roman"/>
-          <w:sz w:val="24"/>
-        </w:rPr>
-        <w:t>Artifact packaging and deployment</w:t>
-      </w:r>
-    </w:p>
-    <w:p>
-      <w:pPr>
-        <w:numPr>
-          <w:ilvl w:val="0"/>
-          <w:numId w:val="2"/>
-        </w:numPr>
-        <w:rPr>
-          <w:rFonts w:ascii="Times New Roman" w:hAnsi="Times New Roman" w:cs="Times New Roman"/>
-          <w:sz w:val="24"/>
-        </w:rPr>
-      </w:pPr>
-      <w:r>
-        <w:rPr>
-          <w:rFonts w:ascii="Times New Roman" w:hAnsi="Times New Roman" w:cs="Times New Roman"/>
-          <w:sz w:val="24"/>
-        </w:rPr>
-        <w:t>Multi-environment deployment support</w:t>
-      </w:r>
-    </w:p>
-    <w:p>
-      <w:pPr>
         <w:rPr>
           <w:rFonts w:ascii="Times New Roman" w:hAnsi="Times New Roman" w:cs="Times New Roman"/>
           <w:b/>
           <w:bCs/>
           <w:sz w:val="24"/>
         </w:rPr>
-      </w:pPr>
-      <w:r>
-        <w:rPr>
-          <w:rFonts w:ascii="Times New Roman" w:hAnsi="Times New Roman" w:cs="Times New Roman"/>
-          <w:b/>
-          <w:bCs/>
-          <w:sz w:val="24"/>
-        </w:rPr>
-        <w:t>2. Quality Assurance</w:t>
-      </w:r>
-    </w:p>
-    <w:p>
-      <w:pPr>
-        <w:numPr>
-          <w:ilvl w:val="0"/>
-          <w:numId w:val="3"/>
-        </w:numPr>
-        <w:rPr>
-          <w:rFonts w:ascii="Times New Roman" w:hAnsi="Times New Roman" w:cs="Times New Roman"/>
-          <w:sz w:val="24"/>
-        </w:rPr>
-      </w:pPr>
-      <w:proofErr w:type="spellStart"/>
-      <w:r>
-        <w:rPr>
-          <w:rFonts w:ascii="Times New Roman" w:hAnsi="Times New Roman" w:cs="Times New Roman"/>
-          <w:sz w:val="24"/>
-        </w:rPr>
-        <w:t>SonarQube</w:t>
-      </w:r>
-      <w:proofErr w:type="spellEnd"/>
-      <w:r>
-        <w:rPr>
-          <w:rFonts w:ascii="Times New Roman" w:hAnsi="Times New Roman" w:cs="Times New Roman"/>
-          <w:sz w:val="24"/>
-        </w:rPr>
-        <w:t xml:space="preserve"> integration for static code analysis</w:t>
-      </w:r>
-    </w:p>
-    <w:p>
-      <w:pPr>
-        <w:numPr>
-          <w:ilvl w:val="0"/>
-          <w:numId w:val="3"/>
-        </w:numPr>
-        <w:rPr>
-          <w:rFonts w:ascii="Times New Roman" w:hAnsi="Times New Roman" w:cs="Times New Roman"/>
-          <w:sz w:val="24"/>
-        </w:rPr>
-      </w:pPr>
-      <w:r>
-        <w:rPr>
-          <w:rFonts w:ascii="Times New Roman" w:hAnsi="Times New Roman" w:cs="Times New Roman"/>
-          <w:sz w:val="24"/>
-        </w:rPr>
-        <w:t>Code coverage requirements (80%+)</w:t>
-      </w:r>
-    </w:p>
-    <w:p>
-      <w:pPr>
-        <w:numPr>
-          <w:ilvl w:val="0"/>
-          <w:numId w:val="3"/>
-        </w:numPr>
-        <w:rPr>
-          <w:rFonts w:ascii="Times New Roman" w:hAnsi="Times New Roman" w:cs="Times New Roman"/>
-          <w:sz w:val="24"/>
-        </w:rPr>
-      </w:pPr>
-      <w:r>
-        <w:rPr>
-          <w:rFonts w:ascii="Times New Roman" w:hAnsi="Times New Roman" w:cs="Times New Roman"/>
-          <w:sz w:val="24"/>
-        </w:rPr>
-        <w:t>Security vulnerability scanning</w:t>
-      </w:r>
-    </w:p>
-    <w:p>
-      <w:pPr>
-        <w:numPr>
-          <w:ilvl w:val="0"/>
-          <w:numId w:val="3"/>
-        </w:numPr>
-        <w:rPr>
-          <w:rFonts w:ascii="Times New Roman" w:hAnsi="Times New Roman" w:cs="Times New Roman"/>
-          <w:sz w:val="24"/>
-        </w:rPr>
-      </w:pPr>
-      <w:r>
-        <w:rPr>
-          <w:rFonts w:ascii="Times New Roman" w:hAnsi="Times New Roman" w:cs="Times New Roman"/>
-          <w:sz w:val="24"/>
-        </w:rPr>
-        <w:t>Maintainability and reliability ratings</w:t>
-      </w:r>
-    </w:p>
-    <w:p>
-      <w:pPr>
-        <w:numPr>
-          <w:ilvl w:val="0"/>
-          <w:numId w:val="3"/>
-        </w:numPr>
-        <w:rPr>
-          <w:rFonts w:ascii="Times New Roman" w:hAnsi="Times New Roman" w:cs="Times New Roman"/>
-          <w:sz w:val="24"/>
-        </w:rPr>
-      </w:pPr>
-      <w:r>
-        <w:rPr>
-          <w:rFonts w:ascii="Times New Roman" w:hAnsi="Times New Roman" w:cs="Times New Roman"/>
-          <w:sz w:val="24"/>
-        </w:rPr>
-        <w:t>Automated quality gate enforcement</w:t>
-      </w:r>
-    </w:p>
-    <w:p>
-      <w:pPr>
-        <w:rPr>
-          <w:rFonts w:ascii="Times New Roman" w:hAnsi="Times New Roman" w:cs="Times New Roman"/>
-          <w:b/>
-          <w:bCs/>
-          <w:sz w:val="24"/>
-        </w:rPr>
-      </w:pPr>
-      <w:r>
-        <w:rPr>
-          <w:rFonts w:ascii="Times New Roman" w:hAnsi="Times New Roman" w:cs="Times New Roman"/>
-          <w:b/>
-          <w:bCs/>
-          <w:sz w:val="24"/>
-        </w:rPr>
-        <w:lastRenderedPageBreak/>
-        <w:t>3. Multi-Environment Deployment</w:t>
-      </w:r>
-    </w:p>
-    <w:p>
-      <w:pPr>
-        <w:numPr>
-          <w:ilvl w:val="0"/>
-          <w:numId w:val="4"/>
-        </w:numPr>
-        <w:rPr>
-          <w:rFonts w:ascii="Times New Roman" w:hAnsi="Times New Roman" w:cs="Times New Roman"/>
-          <w:sz w:val="24"/>
-        </w:rPr>
-      </w:pPr>
-      <w:r>
-        <w:rPr>
-          <w:rFonts w:ascii="Times New Roman" w:hAnsi="Times New Roman" w:cs="Times New Roman"/>
-          <w:sz w:val="24"/>
-        </w:rPr>
-        <w:t>Development → SIT → UAT → Pentest → Pre-Prod → Prod</w:t>
-      </w:r>
-    </w:p>
-    <w:p>
-      <w:pPr>
-        <w:numPr>
-          <w:ilvl w:val="0"/>
-          <w:numId w:val="4"/>
-        </w:numPr>
-        <w:rPr>
-          <w:rFonts w:ascii="Times New Roman" w:hAnsi="Times New Roman" w:cs="Times New Roman"/>
-          <w:sz w:val="24"/>
-        </w:rPr>
-      </w:pPr>
-      <w:r>
-        <w:rPr>
-          <w:rFonts w:ascii="Times New Roman" w:hAnsi="Times New Roman" w:cs="Times New Roman"/>
-          <w:sz w:val="24"/>
-        </w:rPr>
-        <w:t>Parameterized inventory management</w:t>
-      </w:r>
-    </w:p>
-    <w:p>
-      <w:pPr>
-        <w:numPr>
-          <w:ilvl w:val="0"/>
-          <w:numId w:val="4"/>
-        </w:numPr>
-        <w:rPr>
-          <w:rFonts w:ascii="Times New Roman" w:hAnsi="Times New Roman" w:cs="Times New Roman"/>
-          <w:sz w:val="24"/>
-        </w:rPr>
-      </w:pPr>
-      <w:r>
-        <w:rPr>
-          <w:rFonts w:ascii="Times New Roman" w:hAnsi="Times New Roman" w:cs="Times New Roman"/>
-          <w:sz w:val="24"/>
-        </w:rPr>
-        <w:t>Environment-specific configurations</w:t>
-      </w:r>
-    </w:p>
-    <w:p>
-      <w:pPr>
-        <w:numPr>
-          <w:ilvl w:val="0"/>
-          <w:numId w:val="4"/>
-        </w:numPr>
-        <w:rPr>
-          <w:rFonts w:ascii="Times New Roman" w:hAnsi="Times New Roman" w:cs="Times New Roman"/>
-          <w:sz w:val="24"/>
-        </w:rPr>
-      </w:pPr>
-      <w:r>
-        <w:rPr>
-          <w:rFonts w:ascii="Times New Roman" w:hAnsi="Times New Roman" w:cs="Times New Roman"/>
-          <w:sz w:val="24"/>
-        </w:rPr>
-        <w:t>Rollback capabilities</w:t>
-      </w:r>
-    </w:p>
-    <w:p>
-      <w:pPr>
-        <w:rPr>
-          <w:rFonts w:ascii="Times New Roman" w:hAnsi="Times New Roman" w:cs="Times New Roman"/>
-          <w:b/>
-          <w:bCs/>
-          <w:sz w:val="24"/>
-        </w:rPr>
-      </w:pPr>
-      <w:r>
-        <w:rPr>
-          <w:rFonts w:ascii="Times New Roman" w:hAnsi="Times New Roman" w:cs="Times New Roman"/>
-          <w:b/>
-          <w:bCs/>
-          <w:sz w:val="24"/>
-        </w:rPr>
-        <w:t>4. Local Testing Setup</w:t>
-      </w:r>
-    </w:p>
-    <w:p>
-      <w:pPr>
-        <w:numPr>
-          <w:ilvl w:val="0"/>
-          <w:numId w:val="5"/>
-        </w:numPr>
-        <w:rPr>
-          <w:rFonts w:ascii="Times New Roman" w:hAnsi="Times New Roman" w:cs="Times New Roman"/>
-          <w:sz w:val="24"/>
-        </w:rPr>
-      </w:pPr>
-      <w:r>
-        <w:rPr>
-          <w:rFonts w:ascii="Times New Roman" w:hAnsi="Times New Roman" w:cs="Times New Roman"/>
-          <w:sz w:val="24"/>
-        </w:rPr>
-        <w:t>All tools configured on localhost for cost-effective testing</w:t>
-      </w:r>
-    </w:p>
-    <w:p>
-      <w:pPr>
-        <w:numPr>
-          <w:ilvl w:val="0"/>
-          <w:numId w:val="5"/>
-        </w:numPr>
-        <w:rPr>
-          <w:rFonts w:ascii="Times New Roman" w:hAnsi="Times New Roman" w:cs="Times New Roman"/>
-          <w:sz w:val="24"/>
-        </w:rPr>
-      </w:pPr>
-      <w:r>
-        <w:rPr>
-          <w:rFonts w:ascii="Times New Roman" w:hAnsi="Times New Roman" w:cs="Times New Roman"/>
-          <w:sz w:val="24"/>
-        </w:rPr>
-        <w:t>Docker containers simulating production environments</w:t>
-      </w:r>
-    </w:p>
-    <w:p>
-      <w:pPr>
-        <w:numPr>
-          <w:ilvl w:val="0"/>
-          <w:numId w:val="5"/>
-        </w:numPr>
-        <w:rPr>
-          <w:rFonts w:ascii="Times New Roman" w:hAnsi="Times New Roman" w:cs="Times New Roman"/>
-          <w:sz w:val="24"/>
-        </w:rPr>
-      </w:pPr>
-      <w:r>
-        <w:rPr>
-          <w:rFonts w:ascii="Times New Roman" w:hAnsi="Times New Roman" w:cs="Times New Roman"/>
-          <w:sz w:val="24"/>
-        </w:rPr>
-        <w:t>Complete pipeline validation in isolated environment</w:t>
-      </w:r>
-    </w:p>
-    <w:p>
-      <w:pPr>
-        <w:rPr>
-          <w:rFonts w:ascii="Times New Roman" w:hAnsi="Times New Roman" w:cs="Times New Roman"/>
-          <w:b/>
-          <w:bCs/>
-          <w:sz w:val="24"/>
-        </w:rPr>
-      </w:pPr>
-      <w:r>
-        <w:rPr>
-          <w:rFonts w:ascii="Times New Roman" w:hAnsi="Times New Roman" w:cs="Times New Roman"/>
-          <w:b/>
-          <w:bCs/>
-          <w:sz w:val="24"/>
-        </w:rPr>
-        <w:t>Project Deliverables</w:t>
-      </w:r>
-    </w:p>
-    <w:p>
-      <w:pPr>
-        <w:rPr>
-          <w:rFonts w:ascii="Times New Roman" w:hAnsi="Times New Roman" w:cs="Times New Roman"/>
-          <w:sz w:val="24"/>
-        </w:rPr>
-      </w:pPr>
-      <w:r>
-        <w:rPr>
-          <w:rFonts w:ascii="Segoe UI Symbol" w:hAnsi="Segoe UI Symbol" w:cs="Segoe UI Symbol"/>
-          <w:sz w:val="24"/>
-        </w:rPr>
-        <w:t>✅</w:t>
-      </w:r>
-      <w:r>
-        <w:rPr>
-          <w:rFonts w:ascii="Times New Roman" w:hAnsi="Times New Roman" w:cs="Times New Roman"/>
-          <w:sz w:val="24"/>
-        </w:rPr>
-        <w:t xml:space="preserve"> Complete Jenkins pipeline with quality gates</w:t>
-      </w:r>
-      <w:r>
-        <w:rPr>
-          <w:rFonts w:ascii="Times New Roman" w:hAnsi="Times New Roman" w:cs="Times New Roman"/>
-          <w:sz w:val="24"/>
-        </w:rPr>
-        <w:br/>
-      </w:r>
-      <w:r>
-        <w:rPr>
-          <w:rFonts w:ascii="Segoe UI Symbol" w:hAnsi="Segoe UI Symbol" w:cs="Segoe UI Symbol"/>
-          <w:sz w:val="24"/>
-        </w:rPr>
-        <w:t>✅</w:t>
-      </w:r>
-      <w:r>
-        <w:rPr>
-          <w:rFonts w:ascii="Times New Roman" w:hAnsi="Times New Roman" w:cs="Times New Roman"/>
-          <w:sz w:val="24"/>
-        </w:rPr>
-        <w:t xml:space="preserve"> </w:t>
-      </w:r>
-      <w:proofErr w:type="spellStart"/>
-      <w:r>
-        <w:rPr>
-          <w:rFonts w:ascii="Times New Roman" w:hAnsi="Times New Roman" w:cs="Times New Roman"/>
-          <w:sz w:val="24"/>
-        </w:rPr>
-        <w:t>Ansible</w:t>
-      </w:r>
-      <w:proofErr w:type="spellEnd"/>
-      <w:r>
-        <w:rPr>
-          <w:rFonts w:ascii="Times New Roman" w:hAnsi="Times New Roman" w:cs="Times New Roman"/>
-          <w:sz w:val="24"/>
-        </w:rPr>
-        <w:t xml:space="preserve"> roles for all infrastructure components</w:t>
-      </w:r>
-      <w:r>
-        <w:rPr>
-          <w:rFonts w:ascii="Times New Roman" w:hAnsi="Times New Roman" w:cs="Times New Roman"/>
-          <w:sz w:val="24"/>
-        </w:rPr>
-        <w:br/>
-      </w:r>
-      <w:r>
-        <w:rPr>
-          <w:rFonts w:ascii="Segoe UI Symbol" w:hAnsi="Segoe UI Symbol" w:cs="Segoe UI Symbol"/>
-          <w:sz w:val="24"/>
-        </w:rPr>
-        <w:t>✅</w:t>
-      </w:r>
-      <w:r>
-        <w:rPr>
-          <w:rFonts w:ascii="Times New Roman" w:hAnsi="Times New Roman" w:cs="Times New Roman"/>
-          <w:sz w:val="24"/>
-        </w:rPr>
-        <w:t xml:space="preserve"> </w:t>
-      </w:r>
-      <w:proofErr w:type="spellStart"/>
-      <w:r>
-        <w:rPr>
-          <w:rFonts w:ascii="Times New Roman" w:hAnsi="Times New Roman" w:cs="Times New Roman"/>
-          <w:sz w:val="24"/>
-        </w:rPr>
-        <w:t>SonarQube</w:t>
-      </w:r>
-      <w:proofErr w:type="spellEnd"/>
-      <w:r>
-        <w:rPr>
-          <w:rFonts w:ascii="Times New Roman" w:hAnsi="Times New Roman" w:cs="Times New Roman"/>
-          <w:sz w:val="24"/>
-        </w:rPr>
-        <w:t xml:space="preserve"> quality profiles and rules</w:t>
-      </w:r>
-      <w:r>
-        <w:rPr>
-          <w:rFonts w:ascii="Times New Roman" w:hAnsi="Times New Roman" w:cs="Times New Roman"/>
-          <w:sz w:val="24"/>
-        </w:rPr>
-        <w:br/>
-      </w:r>
-      <w:r>
-        <w:rPr>
-          <w:rFonts w:ascii="Segoe UI Symbol" w:hAnsi="Segoe UI Symbol" w:cs="Segoe UI Symbol"/>
-          <w:sz w:val="24"/>
-        </w:rPr>
-        <w:t>✅</w:t>
-      </w:r>
-      <w:r>
-        <w:rPr>
-          <w:rFonts w:ascii="Times New Roman" w:hAnsi="Times New Roman" w:cs="Times New Roman"/>
-          <w:sz w:val="24"/>
-        </w:rPr>
-        <w:t xml:space="preserve"> </w:t>
-      </w:r>
-      <w:proofErr w:type="spellStart"/>
-      <w:r>
-        <w:rPr>
-          <w:rFonts w:ascii="Times New Roman" w:hAnsi="Times New Roman" w:cs="Times New Roman"/>
-          <w:sz w:val="24"/>
-        </w:rPr>
-        <w:t>Artifactory</w:t>
-      </w:r>
-      <w:proofErr w:type="spellEnd"/>
-      <w:r>
-        <w:rPr>
-          <w:rFonts w:ascii="Times New Roman" w:hAnsi="Times New Roman" w:cs="Times New Roman"/>
-          <w:sz w:val="24"/>
-        </w:rPr>
-        <w:t xml:space="preserve"> repository configuration</w:t>
-      </w:r>
-      <w:r>
-        <w:rPr>
-          <w:rFonts w:ascii="Times New Roman" w:hAnsi="Times New Roman" w:cs="Times New Roman"/>
-          <w:sz w:val="24"/>
-        </w:rPr>
-        <w:br/>
-      </w:r>
-      <w:r>
-        <w:rPr>
-          <w:rFonts w:ascii="Segoe UI Symbol" w:hAnsi="Segoe UI Symbol" w:cs="Segoe UI Symbol"/>
-          <w:sz w:val="24"/>
-        </w:rPr>
-        <w:t>✅</w:t>
-      </w:r>
-      <w:r>
-        <w:rPr>
-          <w:rFonts w:ascii="Times New Roman" w:hAnsi="Times New Roman" w:cs="Times New Roman"/>
-          <w:sz w:val="24"/>
-        </w:rPr>
-        <w:t xml:space="preserve"> Multi-environment deployment strategy</w:t>
-      </w:r>
-      <w:r>
-        <w:rPr>
-          <w:rFonts w:ascii="Times New Roman" w:hAnsi="Times New Roman" w:cs="Times New Roman"/>
-          <w:sz w:val="24"/>
-        </w:rPr>
-        <w:br/>
-      </w:r>
-      <w:r>
-        <w:rPr>
-          <w:rFonts w:ascii="Segoe UI Symbol" w:hAnsi="Segoe UI Symbol" w:cs="Segoe UI Symbol"/>
-          <w:sz w:val="24"/>
-        </w:rPr>
-        <w:t>✅</w:t>
-      </w:r>
-      <w:r>
-        <w:rPr>
-          <w:rFonts w:ascii="Times New Roman" w:hAnsi="Times New Roman" w:cs="Times New Roman"/>
-          <w:sz w:val="24"/>
-        </w:rPr>
-        <w:t xml:space="preserve"> Comprehensive documentation and troubleshooting guides</w:t>
-      </w:r>
-    </w:p>
-    <w:p>
-      <w:pPr>
-        <w:rPr>
-          <w:rFonts w:ascii="Times New Roman" w:hAnsi="Times New Roman" w:cs="Times New Roman"/>
-          <w:b/>
-          <w:bCs/>
-          <w:sz w:val="24"/>
-        </w:rPr>
-      </w:pPr>
-      <w:r>
-        <w:rPr>
-          <w:rFonts w:ascii="Times New Roman" w:hAnsi="Times New Roman" w:cs="Times New Roman"/>
-          <w:b/>
-          <w:bCs/>
-          <w:sz w:val="24"/>
-        </w:rPr>
-        <w:t>Challenges Overcome</w:t>
-      </w:r>
-    </w:p>
-    <w:p>
-      <w:pPr>
-        <w:numPr>
-          <w:ilvl w:val="0"/>
-          <w:numId w:val="6"/>
-        </w:numPr>
-        <w:rPr>
-          <w:rFonts w:ascii="Times New Roman" w:hAnsi="Times New Roman" w:cs="Times New Roman"/>
-          <w:sz w:val="24"/>
-        </w:rPr>
-      </w:pPr>
-      <w:r>
-        <w:rPr>
-          <w:rFonts w:ascii="Times New Roman" w:hAnsi="Times New Roman" w:cs="Times New Roman"/>
-          <w:sz w:val="24"/>
-        </w:rPr>
-        <w:t>Tool integration complexities</w:t>
-      </w:r>
-    </w:p>
-    <w:p>
-      <w:pPr>
-        <w:numPr>
-          <w:ilvl w:val="0"/>
-          <w:numId w:val="6"/>
-        </w:numPr>
-        <w:rPr>
-          <w:rFonts w:ascii="Times New Roman" w:hAnsi="Times New Roman" w:cs="Times New Roman"/>
-          <w:sz w:val="24"/>
-        </w:rPr>
-      </w:pPr>
-      <w:r>
-        <w:rPr>
-          <w:rFonts w:ascii="Times New Roman" w:hAnsi="Times New Roman" w:cs="Times New Roman"/>
-          <w:sz w:val="24"/>
-        </w:rPr>
-        <w:t>Quality gate configuration and tuning</w:t>
-      </w:r>
-    </w:p>
-    <w:p>
-      <w:pPr>
-        <w:numPr>
-          <w:ilvl w:val="0"/>
-          <w:numId w:val="6"/>
-        </w:numPr>
-        <w:rPr>
-          <w:rFonts w:ascii="Times New Roman" w:hAnsi="Times New Roman" w:cs="Times New Roman"/>
-          <w:sz w:val="24"/>
-        </w:rPr>
-      </w:pPr>
-      <w:r>
-        <w:rPr>
-          <w:rFonts w:ascii="Times New Roman" w:hAnsi="Times New Roman" w:cs="Times New Roman"/>
-          <w:sz w:val="24"/>
-        </w:rPr>
-        <w:t>Local environment simulation</w:t>
-      </w:r>
-    </w:p>
-    <w:p>
-      <w:pPr>
-        <w:numPr>
-          <w:ilvl w:val="0"/>
-          <w:numId w:val="6"/>
-        </w:numPr>
-        <w:rPr>
-          <w:rFonts w:ascii="Times New Roman" w:hAnsi="Times New Roman" w:cs="Times New Roman"/>
-          <w:sz w:val="24"/>
-        </w:rPr>
-      </w:pPr>
-      <w:r>
-        <w:rPr>
-          <w:rFonts w:ascii="Times New Roman" w:hAnsi="Times New Roman" w:cs="Times New Roman"/>
-          <w:sz w:val="24"/>
-        </w:rPr>
-        <w:t>Pipeline debugging and optimization</w:t>
-      </w:r>
-    </w:p>
-    <w:p>
-      <w:pPr>
-        <w:numPr>
-          <w:ilvl w:val="0"/>
-          <w:numId w:val="6"/>
-        </w:numPr>
-        <w:rPr>
-          <w:rFonts w:ascii="Times New Roman" w:hAnsi="Times New Roman" w:cs="Times New Roman"/>
-          <w:sz w:val="24"/>
-        </w:rPr>
-      </w:pPr>
-      <w:r>
-        <w:rPr>
-          <w:rFonts w:ascii="Times New Roman" w:hAnsi="Times New Roman" w:cs="Times New Roman"/>
-          <w:sz w:val="24"/>
-        </w:rPr>
-        <w:t>Multi-tool authentication and connectivity</w:t>
-      </w:r>
-    </w:p>
-    <w:p>
-      <w:pPr>
-        <w:rPr>
-          <w:rFonts w:ascii="Times New Roman" w:hAnsi="Times New Roman" w:cs="Times New Roman"/>
-          <w:b/>
-          <w:bCs/>
-          <w:sz w:val="24"/>
-        </w:rPr>
-      </w:pPr>
-      <w:r>
-        <w:rPr>
-          <w:rFonts w:ascii="Times New Roman" w:hAnsi="Times New Roman" w:cs="Times New Roman"/>
-          <w:b/>
-          <w:bCs/>
-          <w:sz w:val="24"/>
-        </w:rPr>
-        <w:t>Learning Outcomes</w:t>
-      </w:r>
-    </w:p>
-    <w:p>
-      <w:pPr>
-        <w:numPr>
-          <w:ilvl w:val="0"/>
-          <w:numId w:val="7"/>
-        </w:numPr>
-        <w:rPr>
-          <w:rFonts w:ascii="Times New Roman" w:hAnsi="Times New Roman" w:cs="Times New Roman"/>
-          <w:sz w:val="24"/>
-        </w:rPr>
-      </w:pPr>
-      <w:r>
-        <w:rPr>
-          <w:rFonts w:ascii="Times New Roman" w:hAnsi="Times New Roman" w:cs="Times New Roman"/>
-          <w:sz w:val="24"/>
-        </w:rPr>
-        <w:t>Mastered end-to-end CI/CD pipeline design</w:t>
-      </w:r>
-    </w:p>
-    <w:p>
-      <w:pPr>
-        <w:numPr>
-          <w:ilvl w:val="0"/>
-          <w:numId w:val="7"/>
-        </w:numPr>
-        <w:rPr>
-          <w:rFonts w:ascii="Times New Roman" w:hAnsi="Times New Roman" w:cs="Times New Roman"/>
-          <w:sz w:val="24"/>
-        </w:rPr>
-      </w:pPr>
-      <w:r>
-        <w:rPr>
-          <w:rFonts w:ascii="Times New Roman" w:hAnsi="Times New Roman" w:cs="Times New Roman"/>
-          <w:sz w:val="24"/>
-        </w:rPr>
-        <w:t>Gained expertise in DevOps tool integration</w:t>
-      </w:r>
-    </w:p>
-    <w:p>
-      <w:pPr>
-        <w:numPr>
-          <w:ilvl w:val="0"/>
-          <w:numId w:val="7"/>
-        </w:numPr>
-        <w:rPr>
-          <w:rFonts w:ascii="Times New Roman" w:hAnsi="Times New Roman" w:cs="Times New Roman"/>
-          <w:sz w:val="24"/>
-        </w:rPr>
-      </w:pPr>
-      <w:r>
-        <w:rPr>
-          <w:rFonts w:ascii="Times New Roman" w:hAnsi="Times New Roman" w:cs="Times New Roman"/>
-          <w:sz w:val="24"/>
-        </w:rPr>
-        <w:t>Developed troubleshooting skills for complex systems</w:t>
-      </w:r>
-    </w:p>
-    <w:p>
-      <w:pPr>
-        <w:numPr>
-          <w:ilvl w:val="0"/>
-          <w:numId w:val="7"/>
-        </w:numPr>
-        <w:rPr>
-          <w:rFonts w:ascii="Times New Roman" w:hAnsi="Times New Roman" w:cs="Times New Roman"/>
-          <w:sz w:val="24"/>
-        </w:rPr>
-      </w:pPr>
-      <w:r>
-        <w:rPr>
-          <w:rFonts w:ascii="Times New Roman" w:hAnsi="Times New Roman" w:cs="Times New Roman"/>
-          <w:sz w:val="24"/>
-        </w:rPr>
-        <w:t>Learned to implement and enforce code quality standards</w:t>
-      </w:r>
-    </w:p>
-    <w:p>
-      <w:pPr>
-        <w:numPr>
-          <w:ilvl w:val="0"/>
-          <w:numId w:val="7"/>
-        </w:numPr>
-        <w:rPr>
-          <w:rFonts w:ascii="Times New Roman" w:hAnsi="Times New Roman" w:cs="Times New Roman"/>
-          <w:sz w:val="24"/>
-        </w:rPr>
-      </w:pPr>
-      <w:r>
-        <w:rPr>
-          <w:rFonts w:ascii="Times New Roman" w:hAnsi="Times New Roman" w:cs="Times New Roman"/>
-          <w:sz w:val="24"/>
-        </w:rPr>
-        <w:t>Acquired experience in multi-environment deployment strategies</w:t>
-      </w:r>
-    </w:p>
-    <w:p>
-      <w:pPr>
-        <w:rPr>
-          <w:rFonts w:ascii="Times New Roman" w:hAnsi="Times New Roman" w:cs="Times New Roman"/>
-          <w:b/>
-          <w:bCs/>
-          <w:sz w:val="24"/>
-        </w:rPr>
-      </w:pPr>
-      <w:r>
-        <w:rPr>
-          <w:rFonts w:ascii="Times New Roman" w:hAnsi="Times New Roman" w:cs="Times New Roman"/>
-          <w:b/>
-          <w:bCs/>
-          <w:sz w:val="24"/>
-        </w:rPr>
-        <w:t>GitHub Repository</w:t>
-      </w:r>
-    </w:p>
-    <w:p>
-      <w:pPr>
-        <w:rPr>
-          <w:rFonts w:ascii="Times New Roman" w:hAnsi="Times New Roman" w:cs="Times New Roman"/>
-          <w:sz w:val="24"/>
-        </w:rPr>
-      </w:pPr>
-      <w:hyperlink r:id="rId5" w:history="1">
-        <w:r>
-          <w:rPr>
-            <w:rStyle w:val="Hyperlink"/>
-            <w:rFonts w:ascii="Times New Roman" w:hAnsi="Times New Roman" w:cs="Times New Roman"/>
-            <w:sz w:val="24"/>
-          </w:rPr>
-          <w:t>StegHub_DevOps/project13/README.md at main · 123Origami/</w:t>
-        </w:r>
-        <w:proofErr w:type="spellStart"/>
-        <w:r>
-          <w:rPr>
-            <w:rStyle w:val="Hyperlink"/>
-            <w:rFonts w:ascii="Times New Roman" w:hAnsi="Times New Roman" w:cs="Times New Roman"/>
-            <w:sz w:val="24"/>
-          </w:rPr>
-          <w:t>StegHub_DevOps</w:t>
-        </w:r>
-        <w:proofErr w:type="spellEnd"/>
-      </w:hyperlink>
-    </w:p>
-    <w:p>
-      <w:pPr>
-        <w:rPr>
-          <w:rFonts w:ascii="Times New Roman" w:hAnsi="Times New Roman" w:cs="Times New Roman"/>
-          <w:b/>
-          <w:bCs/>
-          <w:sz w:val="24"/>
-        </w:rPr>
-      </w:pPr>
-      <w:r>
-        <w:rPr>
-          <w:rFonts w:ascii="Times New Roman" w:hAnsi="Times New Roman" w:cs="Times New Roman"/>
-          <w:b/>
-          <w:bCs/>
-          <w:sz w:val="24"/>
-        </w:rPr>
-        <w:t>LinkedIn Post</w:t>
-      </w:r>
-    </w:p>
-    <w:p>
-      <w:pPr>
-        <w:rPr>
-          <w:rFonts w:ascii="Times New Roman" w:hAnsi="Times New Roman" w:cs="Times New Roman"/>
-          <w:b/>
-          <w:bCs/>
-          <w:sz w:val="24"/>
-        </w:rPr>
-      </w:pPr>
-      <w:hyperlink r:id="rId6" w:history="1">
-        <w:r>
-          <w:rPr>
-            <w:rStyle w:val="Hyperlink"/>
-            <w:rFonts w:ascii="Times New Roman" w:hAnsi="Times New Roman" w:cs="Times New Roman"/>
-            <w:b/>
-            <w:bCs/>
-            <w:sz w:val="24"/>
-          </w:rPr>
-          <w:t>https://www.linkedin.com/posts/sally-m-09546a245_devops-cicd-jenkins-activity-7404805001014927360-sOjH?utm_source=share&amp;utm_medium=member_desktop&amp;rcm=ACoAADzCKfEBZK3LPTQ5D0pi879scjlAX0g4FTk</w:t>
-        </w:r>
-      </w:hyperlink>
-    </w:p>
-    <w:p>
-      <w:pPr>
-        <w:rPr>
-          <w:rFonts w:ascii="Times New Roman" w:hAnsi="Times New Roman" w:cs="Times New Roman"/>
-          <w:b/>
-          <w:bCs/>
-          <w:sz w:val="24"/>
-        </w:rPr>
-      </w:pPr>
+        <w:t>Database migration automation</w:t>
+      </w:r>
+      <w:r>
+        <w:rPr>
+          <w:rFonts w:ascii="Times New Roman" w:hAnsi="Times New Roman" w:cs="Times New Roman"/>
+          <w:sz w:val="24"/>
+        </w:rPr>
+        <w:t> within the pipeline</w:t>
+      </w:r>
     </w:p>
     <w:p>
       <w:pPr>
@@ -1402,6 +1251,453 @@
 <file path=word/numbering.xml><?xml version="1.0" encoding="utf-8"?>
 <w:numbering xmlns:wpc="http://schemas.microsoft.com/office/word/2010/wordprocessingCanvas" xmlns:cx="http://schemas.microsoft.com/office/drawing/2014/chartex" xmlns:mc="http://schemas.openxmlformats.org/markup-compatibility/2006" xmlns:o="urn:schemas-microsoft-com:office:office" xmlns:r="http://schemas.openxmlformats.org/officeDocument/2006/relationships" xmlns:m="http://schemas.openxmlformats.org/officeDocument/2006/math" xmlns:v="urn:schemas-microsoft-com:vml" xmlns:wp14="http://schemas.microsoft.com/office/word/2010/wordprocessingDrawing" xmlns:wp="http://schemas.openxmlformats.org/drawingml/2006/wordprocessingDrawing" xmlns:w10="urn:schemas-microsoft-com:office:word" xmlns:w="http://schemas.openxmlformats.org/wordprocessingml/2006/main" xmlns:w14="http://schemas.microsoft.com/office/word/2010/wordml" xmlns:w15="http://schemas.microsoft.com/office/word/2012/wordml" xmlns:w16se="http://schemas.microsoft.com/office/word/2015/wordml/symex" xmlns:wpg="http://schemas.microsoft.com/office/word/2010/wordprocessingGroup" xmlns:wpi="http://schemas.microsoft.com/office/word/2010/wordprocessingInk" xmlns:wne="http://schemas.microsoft.com/office/word/2006/wordml" xmlns:wps="http://schemas.microsoft.com/office/word/2010/wordprocessingShape" mc:Ignorable="w14 w15 w16se wp14">
   <w:abstractNum w:abstractNumId="0" w15:restartNumberingAfterBreak="0">
+    <w:nsid w:val="0546026D"/>
+    <w:multiLevelType w:val="multilevel"/>
+    <w:tmpl w:val="5F584D3C"/>
+    <w:lvl w:ilvl="0">
+      <w:start w:val="1"/>
+      <w:numFmt w:val="bullet"/>
+      <w:lvlText w:val=""/>
+      <w:lvlJc w:val="left"/>
+      <w:pPr>
+        <w:tabs>
+          <w:tab w:val="num" w:pos="720"/>
+        </w:tabs>
+        <w:ind w:left="720" w:hanging="360"/>
+      </w:pPr>
+      <w:rPr>
+        <w:rFonts w:ascii="Symbol" w:hAnsi="Symbol" w:hint="default"/>
+        <w:sz w:val="20"/>
+      </w:rPr>
+    </w:lvl>
+    <w:lvl w:ilvl="1" w:tentative="1">
+      <w:start w:val="1"/>
+      <w:numFmt w:val="bullet"/>
+      <w:lvlText w:val="o"/>
+      <w:lvlJc w:val="left"/>
+      <w:pPr>
+        <w:tabs>
+          <w:tab w:val="num" w:pos="1440"/>
+        </w:tabs>
+        <w:ind w:left="1440" w:hanging="360"/>
+      </w:pPr>
+      <w:rPr>
+        <w:rFonts w:ascii="Courier New" w:hAnsi="Courier New" w:hint="default"/>
+        <w:sz w:val="20"/>
+      </w:rPr>
+    </w:lvl>
+    <w:lvl w:ilvl="2" w:tentative="1">
+      <w:start w:val="1"/>
+      <w:numFmt w:val="bullet"/>
+      <w:lvlText w:val=""/>
+      <w:lvlJc w:val="left"/>
+      <w:pPr>
+        <w:tabs>
+          <w:tab w:val="num" w:pos="2160"/>
+        </w:tabs>
+        <w:ind w:left="2160" w:hanging="360"/>
+      </w:pPr>
+      <w:rPr>
+        <w:rFonts w:ascii="Wingdings" w:hAnsi="Wingdings" w:hint="default"/>
+        <w:sz w:val="20"/>
+      </w:rPr>
+    </w:lvl>
+    <w:lvl w:ilvl="3" w:tentative="1">
+      <w:start w:val="1"/>
+      <w:numFmt w:val="bullet"/>
+      <w:lvlText w:val=""/>
+      <w:lvlJc w:val="left"/>
+      <w:pPr>
+        <w:tabs>
+          <w:tab w:val="num" w:pos="2880"/>
+        </w:tabs>
+        <w:ind w:left="2880" w:hanging="360"/>
+      </w:pPr>
+      <w:rPr>
+        <w:rFonts w:ascii="Wingdings" w:hAnsi="Wingdings" w:hint="default"/>
+        <w:sz w:val="20"/>
+      </w:rPr>
+    </w:lvl>
+    <w:lvl w:ilvl="4" w:tentative="1">
+      <w:start w:val="1"/>
+      <w:numFmt w:val="bullet"/>
+      <w:lvlText w:val=""/>
+      <w:lvlJc w:val="left"/>
+      <w:pPr>
+        <w:tabs>
+          <w:tab w:val="num" w:pos="3600"/>
+        </w:tabs>
+        <w:ind w:left="3600" w:hanging="360"/>
+      </w:pPr>
+      <w:rPr>
+        <w:rFonts w:ascii="Wingdings" w:hAnsi="Wingdings" w:hint="default"/>
+        <w:sz w:val="20"/>
+      </w:rPr>
+    </w:lvl>
+    <w:lvl w:ilvl="5" w:tentative="1">
+      <w:start w:val="1"/>
+      <w:numFmt w:val="bullet"/>
+      <w:lvlText w:val=""/>
+      <w:lvlJc w:val="left"/>
+      <w:pPr>
+        <w:tabs>
+          <w:tab w:val="num" w:pos="4320"/>
+        </w:tabs>
+        <w:ind w:left="4320" w:hanging="360"/>
+      </w:pPr>
+      <w:rPr>
+        <w:rFonts w:ascii="Wingdings" w:hAnsi="Wingdings" w:hint="default"/>
+        <w:sz w:val="20"/>
+      </w:rPr>
+    </w:lvl>
+    <w:lvl w:ilvl="6" w:tentative="1">
+      <w:start w:val="1"/>
+      <w:numFmt w:val="bullet"/>
+      <w:lvlText w:val=""/>
+      <w:lvlJc w:val="left"/>
+      <w:pPr>
+        <w:tabs>
+          <w:tab w:val="num" w:pos="5040"/>
+        </w:tabs>
+        <w:ind w:left="5040" w:hanging="360"/>
+      </w:pPr>
+      <w:rPr>
+        <w:rFonts w:ascii="Wingdings" w:hAnsi="Wingdings" w:hint="default"/>
+        <w:sz w:val="20"/>
+      </w:rPr>
+    </w:lvl>
+    <w:lvl w:ilvl="7" w:tentative="1">
+      <w:start w:val="1"/>
+      <w:numFmt w:val="bullet"/>
+      <w:lvlText w:val=""/>
+      <w:lvlJc w:val="left"/>
+      <w:pPr>
+        <w:tabs>
+          <w:tab w:val="num" w:pos="5760"/>
+        </w:tabs>
+        <w:ind w:left="5760" w:hanging="360"/>
+      </w:pPr>
+      <w:rPr>
+        <w:rFonts w:ascii="Wingdings" w:hAnsi="Wingdings" w:hint="default"/>
+        <w:sz w:val="20"/>
+      </w:rPr>
+    </w:lvl>
+    <w:lvl w:ilvl="8" w:tentative="1">
+      <w:start w:val="1"/>
+      <w:numFmt w:val="bullet"/>
+      <w:lvlText w:val=""/>
+      <w:lvlJc w:val="left"/>
+      <w:pPr>
+        <w:tabs>
+          <w:tab w:val="num" w:pos="6480"/>
+        </w:tabs>
+        <w:ind w:left="6480" w:hanging="360"/>
+      </w:pPr>
+      <w:rPr>
+        <w:rFonts w:ascii="Wingdings" w:hAnsi="Wingdings" w:hint="default"/>
+        <w:sz w:val="20"/>
+      </w:rPr>
+    </w:lvl>
+  </w:abstractNum>
+  <w:abstractNum w:abstractNumId="1" w15:restartNumberingAfterBreak="0">
+    <w:nsid w:val="101E00B8"/>
+    <w:multiLevelType w:val="multilevel"/>
+    <w:tmpl w:val="86A286CE"/>
+    <w:lvl w:ilvl="0">
+      <w:start w:val="1"/>
+      <w:numFmt w:val="bullet"/>
+      <w:lvlText w:val=""/>
+      <w:lvlJc w:val="left"/>
+      <w:pPr>
+        <w:tabs>
+          <w:tab w:val="num" w:pos="720"/>
+        </w:tabs>
+        <w:ind w:left="720" w:hanging="360"/>
+      </w:pPr>
+      <w:rPr>
+        <w:rFonts w:ascii="Symbol" w:hAnsi="Symbol" w:hint="default"/>
+        <w:sz w:val="20"/>
+      </w:rPr>
+    </w:lvl>
+    <w:lvl w:ilvl="1" w:tentative="1">
+      <w:start w:val="1"/>
+      <w:numFmt w:val="bullet"/>
+      <w:lvlText w:val="o"/>
+      <w:lvlJc w:val="left"/>
+      <w:pPr>
+        <w:tabs>
+          <w:tab w:val="num" w:pos="1440"/>
+        </w:tabs>
+        <w:ind w:left="1440" w:hanging="360"/>
+      </w:pPr>
+      <w:rPr>
+        <w:rFonts w:ascii="Courier New" w:hAnsi="Courier New" w:hint="default"/>
+        <w:sz w:val="20"/>
+      </w:rPr>
+    </w:lvl>
+    <w:lvl w:ilvl="2" w:tentative="1">
+      <w:start w:val="1"/>
+      <w:numFmt w:val="bullet"/>
+      <w:lvlText w:val=""/>
+      <w:lvlJc w:val="left"/>
+      <w:pPr>
+        <w:tabs>
+          <w:tab w:val="num" w:pos="2160"/>
+        </w:tabs>
+        <w:ind w:left="2160" w:hanging="360"/>
+      </w:pPr>
+      <w:rPr>
+        <w:rFonts w:ascii="Wingdings" w:hAnsi="Wingdings" w:hint="default"/>
+        <w:sz w:val="20"/>
+      </w:rPr>
+    </w:lvl>
+    <w:lvl w:ilvl="3" w:tentative="1">
+      <w:start w:val="1"/>
+      <w:numFmt w:val="bullet"/>
+      <w:lvlText w:val=""/>
+      <w:lvlJc w:val="left"/>
+      <w:pPr>
+        <w:tabs>
+          <w:tab w:val="num" w:pos="2880"/>
+        </w:tabs>
+        <w:ind w:left="2880" w:hanging="360"/>
+      </w:pPr>
+      <w:rPr>
+        <w:rFonts w:ascii="Wingdings" w:hAnsi="Wingdings" w:hint="default"/>
+        <w:sz w:val="20"/>
+      </w:rPr>
+    </w:lvl>
+    <w:lvl w:ilvl="4" w:tentative="1">
+      <w:start w:val="1"/>
+      <w:numFmt w:val="bullet"/>
+      <w:lvlText w:val=""/>
+      <w:lvlJc w:val="left"/>
+      <w:pPr>
+        <w:tabs>
+          <w:tab w:val="num" w:pos="3600"/>
+        </w:tabs>
+        <w:ind w:left="3600" w:hanging="360"/>
+      </w:pPr>
+      <w:rPr>
+        <w:rFonts w:ascii="Wingdings" w:hAnsi="Wingdings" w:hint="default"/>
+        <w:sz w:val="20"/>
+      </w:rPr>
+    </w:lvl>
+    <w:lvl w:ilvl="5" w:tentative="1">
+      <w:start w:val="1"/>
+      <w:numFmt w:val="bullet"/>
+      <w:lvlText w:val=""/>
+      <w:lvlJc w:val="left"/>
+      <w:pPr>
+        <w:tabs>
+          <w:tab w:val="num" w:pos="4320"/>
+        </w:tabs>
+        <w:ind w:left="4320" w:hanging="360"/>
+      </w:pPr>
+      <w:rPr>
+        <w:rFonts w:ascii="Wingdings" w:hAnsi="Wingdings" w:hint="default"/>
+        <w:sz w:val="20"/>
+      </w:rPr>
+    </w:lvl>
+    <w:lvl w:ilvl="6" w:tentative="1">
+      <w:start w:val="1"/>
+      <w:numFmt w:val="bullet"/>
+      <w:lvlText w:val=""/>
+      <w:lvlJc w:val="left"/>
+      <w:pPr>
+        <w:tabs>
+          <w:tab w:val="num" w:pos="5040"/>
+        </w:tabs>
+        <w:ind w:left="5040" w:hanging="360"/>
+      </w:pPr>
+      <w:rPr>
+        <w:rFonts w:ascii="Wingdings" w:hAnsi="Wingdings" w:hint="default"/>
+        <w:sz w:val="20"/>
+      </w:rPr>
+    </w:lvl>
+    <w:lvl w:ilvl="7" w:tentative="1">
+      <w:start w:val="1"/>
+      <w:numFmt w:val="bullet"/>
+      <w:lvlText w:val=""/>
+      <w:lvlJc w:val="left"/>
+      <w:pPr>
+        <w:tabs>
+          <w:tab w:val="num" w:pos="5760"/>
+        </w:tabs>
+        <w:ind w:left="5760" w:hanging="360"/>
+      </w:pPr>
+      <w:rPr>
+        <w:rFonts w:ascii="Wingdings" w:hAnsi="Wingdings" w:hint="default"/>
+        <w:sz w:val="20"/>
+      </w:rPr>
+    </w:lvl>
+    <w:lvl w:ilvl="8" w:tentative="1">
+      <w:start w:val="1"/>
+      <w:numFmt w:val="bullet"/>
+      <w:lvlText w:val=""/>
+      <w:lvlJc w:val="left"/>
+      <w:pPr>
+        <w:tabs>
+          <w:tab w:val="num" w:pos="6480"/>
+        </w:tabs>
+        <w:ind w:left="6480" w:hanging="360"/>
+      </w:pPr>
+      <w:rPr>
+        <w:rFonts w:ascii="Wingdings" w:hAnsi="Wingdings" w:hint="default"/>
+        <w:sz w:val="20"/>
+      </w:rPr>
+    </w:lvl>
+  </w:abstractNum>
+  <w:abstractNum w:abstractNumId="2" w15:restartNumberingAfterBreak="0">
+    <w:nsid w:val="20EB1562"/>
+    <w:multiLevelType w:val="multilevel"/>
+    <w:tmpl w:val="F45E4A76"/>
+    <w:lvl w:ilvl="0">
+      <w:start w:val="1"/>
+      <w:numFmt w:val="bullet"/>
+      <w:lvlText w:val=""/>
+      <w:lvlJc w:val="left"/>
+      <w:pPr>
+        <w:tabs>
+          <w:tab w:val="num" w:pos="720"/>
+        </w:tabs>
+        <w:ind w:left="720" w:hanging="360"/>
+      </w:pPr>
+      <w:rPr>
+        <w:rFonts w:ascii="Symbol" w:hAnsi="Symbol" w:hint="default"/>
+        <w:sz w:val="20"/>
+      </w:rPr>
+    </w:lvl>
+    <w:lvl w:ilvl="1" w:tentative="1">
+      <w:start w:val="1"/>
+      <w:numFmt w:val="bullet"/>
+      <w:lvlText w:val="o"/>
+      <w:lvlJc w:val="left"/>
+      <w:pPr>
+        <w:tabs>
+          <w:tab w:val="num" w:pos="1440"/>
+        </w:tabs>
+        <w:ind w:left="1440" w:hanging="360"/>
+      </w:pPr>
+      <w:rPr>
+        <w:rFonts w:ascii="Courier New" w:hAnsi="Courier New" w:hint="default"/>
+        <w:sz w:val="20"/>
+      </w:rPr>
+    </w:lvl>
+    <w:lvl w:ilvl="2" w:tentative="1">
+      <w:start w:val="1"/>
+      <w:numFmt w:val="bullet"/>
+      <w:lvlText w:val=""/>
+      <w:lvlJc w:val="left"/>
+      <w:pPr>
+        <w:tabs>
+          <w:tab w:val="num" w:pos="2160"/>
+        </w:tabs>
+        <w:ind w:left="2160" w:hanging="360"/>
+      </w:pPr>
+      <w:rPr>
+        <w:rFonts w:ascii="Wingdings" w:hAnsi="Wingdings" w:hint="default"/>
+        <w:sz w:val="20"/>
+      </w:rPr>
+    </w:lvl>
+    <w:lvl w:ilvl="3" w:tentative="1">
+      <w:start w:val="1"/>
+      <w:numFmt w:val="bullet"/>
+      <w:lvlText w:val=""/>
+      <w:lvlJc w:val="left"/>
+      <w:pPr>
+        <w:tabs>
+          <w:tab w:val="num" w:pos="2880"/>
+        </w:tabs>
+        <w:ind w:left="2880" w:hanging="360"/>
+      </w:pPr>
+      <w:rPr>
+        <w:rFonts w:ascii="Wingdings" w:hAnsi="Wingdings" w:hint="default"/>
+        <w:sz w:val="20"/>
+      </w:rPr>
+    </w:lvl>
+    <w:lvl w:ilvl="4" w:tentative="1">
+      <w:start w:val="1"/>
+      <w:numFmt w:val="bullet"/>
+      <w:lvlText w:val=""/>
+      <w:lvlJc w:val="left"/>
+      <w:pPr>
+        <w:tabs>
+          <w:tab w:val="num" w:pos="3600"/>
+        </w:tabs>
+        <w:ind w:left="3600" w:hanging="360"/>
+      </w:pPr>
+      <w:rPr>
+        <w:rFonts w:ascii="Wingdings" w:hAnsi="Wingdings" w:hint="default"/>
+        <w:sz w:val="20"/>
+      </w:rPr>
+    </w:lvl>
+    <w:lvl w:ilvl="5" w:tentative="1">
+      <w:start w:val="1"/>
+      <w:numFmt w:val="bullet"/>
+      <w:lvlText w:val=""/>
+      <w:lvlJc w:val="left"/>
+      <w:pPr>
+        <w:tabs>
+          <w:tab w:val="num" w:pos="4320"/>
+        </w:tabs>
+        <w:ind w:left="4320" w:hanging="360"/>
+      </w:pPr>
+      <w:rPr>
+        <w:rFonts w:ascii="Wingdings" w:hAnsi="Wingdings" w:hint="default"/>
+        <w:sz w:val="20"/>
+      </w:rPr>
+    </w:lvl>
+    <w:lvl w:ilvl="6" w:tentative="1">
+      <w:start w:val="1"/>
+      <w:numFmt w:val="bullet"/>
+      <w:lvlText w:val=""/>
+      <w:lvlJc w:val="left"/>
+      <w:pPr>
+        <w:tabs>
+          <w:tab w:val="num" w:pos="5040"/>
+        </w:tabs>
+        <w:ind w:left="5040" w:hanging="360"/>
+      </w:pPr>
+      <w:rPr>
+        <w:rFonts w:ascii="Wingdings" w:hAnsi="Wingdings" w:hint="default"/>
+        <w:sz w:val="20"/>
+      </w:rPr>
+    </w:lvl>
+    <w:lvl w:ilvl="7" w:tentative="1">
+      <w:start w:val="1"/>
+      <w:numFmt w:val="bullet"/>
+      <w:lvlText w:val=""/>
+      <w:lvlJc w:val="left"/>
+      <w:pPr>
+        <w:tabs>
+          <w:tab w:val="num" w:pos="5760"/>
+        </w:tabs>
+        <w:ind w:left="5760" w:hanging="360"/>
+      </w:pPr>
+      <w:rPr>
+        <w:rFonts w:ascii="Wingdings" w:hAnsi="Wingdings" w:hint="default"/>
+        <w:sz w:val="20"/>
+      </w:rPr>
+    </w:lvl>
+    <w:lvl w:ilvl="8" w:tentative="1">
+      <w:start w:val="1"/>
+      <w:numFmt w:val="bullet"/>
+      <w:lvlText w:val=""/>
+      <w:lvlJc w:val="left"/>
+      <w:pPr>
+        <w:tabs>
+          <w:tab w:val="num" w:pos="6480"/>
+        </w:tabs>
+        <w:ind w:left="6480" w:hanging="360"/>
+      </w:pPr>
+      <w:rPr>
+        <w:rFonts w:ascii="Wingdings" w:hAnsi="Wingdings" w:hint="default"/>
+        <w:sz w:val="20"/>
+      </w:rPr>
+    </w:lvl>
+  </w:abstractNum>
+  <w:abstractNum w:abstractNumId="3" w15:restartNumberingAfterBreak="0">
     <w:nsid w:val="22CE63A2"/>
     <w:multiLevelType w:val="multilevel"/>
     <w:tmpl w:val="177A102A"/>
@@ -1550,7 +1846,7 @@
       </w:rPr>
     </w:lvl>
   </w:abstractNum>
-  <w:abstractNum w:abstractNumId="1" w15:restartNumberingAfterBreak="0">
+  <w:abstractNum w:abstractNumId="4" w15:restartNumberingAfterBreak="0">
     <w:nsid w:val="335B6047"/>
     <w:multiLevelType w:val="multilevel"/>
     <w:tmpl w:val="8A0A225E"/>
@@ -1699,7 +1995,7 @@
       </w:rPr>
     </w:lvl>
   </w:abstractNum>
-  <w:abstractNum w:abstractNumId="2" w15:restartNumberingAfterBreak="0">
+  <w:abstractNum w:abstractNumId="5" w15:restartNumberingAfterBreak="0">
     <w:nsid w:val="349E4781"/>
     <w:multiLevelType w:val="multilevel"/>
     <w:tmpl w:val="D84ED3BA"/>
@@ -1848,7 +2144,418 @@
       </w:rPr>
     </w:lvl>
   </w:abstractNum>
-  <w:abstractNum w:abstractNumId="3" w15:restartNumberingAfterBreak="0">
+  <w:abstractNum w:abstractNumId="6" w15:restartNumberingAfterBreak="0">
+    <w:nsid w:val="3C066FCC"/>
+    <w:multiLevelType w:val="multilevel"/>
+    <w:tmpl w:val="66A2C2DA"/>
+    <w:lvl w:ilvl="0">
+      <w:start w:val="1"/>
+      <w:numFmt w:val="decimal"/>
+      <w:lvlText w:val="%1."/>
+      <w:lvlJc w:val="left"/>
+      <w:pPr>
+        <w:tabs>
+          <w:tab w:val="num" w:pos="720"/>
+        </w:tabs>
+        <w:ind w:left="720" w:hanging="360"/>
+      </w:pPr>
+    </w:lvl>
+    <w:lvl w:ilvl="1" w:tentative="1">
+      <w:start w:val="1"/>
+      <w:numFmt w:val="decimal"/>
+      <w:lvlText w:val="%2."/>
+      <w:lvlJc w:val="left"/>
+      <w:pPr>
+        <w:tabs>
+          <w:tab w:val="num" w:pos="1440"/>
+        </w:tabs>
+        <w:ind w:left="1440" w:hanging="360"/>
+      </w:pPr>
+    </w:lvl>
+    <w:lvl w:ilvl="2" w:tentative="1">
+      <w:start w:val="1"/>
+      <w:numFmt w:val="decimal"/>
+      <w:lvlText w:val="%3."/>
+      <w:lvlJc w:val="left"/>
+      <w:pPr>
+        <w:tabs>
+          <w:tab w:val="num" w:pos="2160"/>
+        </w:tabs>
+        <w:ind w:left="2160" w:hanging="360"/>
+      </w:pPr>
+    </w:lvl>
+    <w:lvl w:ilvl="3" w:tentative="1">
+      <w:start w:val="1"/>
+      <w:numFmt w:val="decimal"/>
+      <w:lvlText w:val="%4."/>
+      <w:lvlJc w:val="left"/>
+      <w:pPr>
+        <w:tabs>
+          <w:tab w:val="num" w:pos="2880"/>
+        </w:tabs>
+        <w:ind w:left="2880" w:hanging="360"/>
+      </w:pPr>
+    </w:lvl>
+    <w:lvl w:ilvl="4" w:tentative="1">
+      <w:start w:val="1"/>
+      <w:numFmt w:val="decimal"/>
+      <w:lvlText w:val="%5."/>
+      <w:lvlJc w:val="left"/>
+      <w:pPr>
+        <w:tabs>
+          <w:tab w:val="num" w:pos="3600"/>
+        </w:tabs>
+        <w:ind w:left="3600" w:hanging="360"/>
+      </w:pPr>
+    </w:lvl>
+    <w:lvl w:ilvl="5" w:tentative="1">
+      <w:start w:val="1"/>
+      <w:numFmt w:val="decimal"/>
+      <w:lvlText w:val="%6."/>
+      <w:lvlJc w:val="left"/>
+      <w:pPr>
+        <w:tabs>
+          <w:tab w:val="num" w:pos="4320"/>
+        </w:tabs>
+        <w:ind w:left="4320" w:hanging="360"/>
+      </w:pPr>
+    </w:lvl>
+    <w:lvl w:ilvl="6" w:tentative="1">
+      <w:start w:val="1"/>
+      <w:numFmt w:val="decimal"/>
+      <w:lvlText w:val="%7."/>
+      <w:lvlJc w:val="left"/>
+      <w:pPr>
+        <w:tabs>
+          <w:tab w:val="num" w:pos="5040"/>
+        </w:tabs>
+        <w:ind w:left="5040" w:hanging="360"/>
+      </w:pPr>
+    </w:lvl>
+    <w:lvl w:ilvl="7" w:tentative="1">
+      <w:start w:val="1"/>
+      <w:numFmt w:val="decimal"/>
+      <w:lvlText w:val="%8."/>
+      <w:lvlJc w:val="left"/>
+      <w:pPr>
+        <w:tabs>
+          <w:tab w:val="num" w:pos="5760"/>
+        </w:tabs>
+        <w:ind w:left="5760" w:hanging="360"/>
+      </w:pPr>
+    </w:lvl>
+    <w:lvl w:ilvl="8" w:tentative="1">
+      <w:start w:val="1"/>
+      <w:numFmt w:val="decimal"/>
+      <w:lvlText w:val="%9."/>
+      <w:lvlJc w:val="left"/>
+      <w:pPr>
+        <w:tabs>
+          <w:tab w:val="num" w:pos="6480"/>
+        </w:tabs>
+        <w:ind w:left="6480" w:hanging="360"/>
+      </w:pPr>
+    </w:lvl>
+  </w:abstractNum>
+  <w:abstractNum w:abstractNumId="7" w15:restartNumberingAfterBreak="0">
+    <w:nsid w:val="3E770DB8"/>
+    <w:multiLevelType w:val="multilevel"/>
+    <w:tmpl w:val="D85E3978"/>
+    <w:lvl w:ilvl="0">
+      <w:start w:val="1"/>
+      <w:numFmt w:val="bullet"/>
+      <w:lvlText w:val=""/>
+      <w:lvlJc w:val="left"/>
+      <w:pPr>
+        <w:tabs>
+          <w:tab w:val="num" w:pos="720"/>
+        </w:tabs>
+        <w:ind w:left="720" w:hanging="360"/>
+      </w:pPr>
+      <w:rPr>
+        <w:rFonts w:ascii="Symbol" w:hAnsi="Symbol" w:hint="default"/>
+        <w:sz w:val="20"/>
+      </w:rPr>
+    </w:lvl>
+    <w:lvl w:ilvl="1" w:tentative="1">
+      <w:start w:val="1"/>
+      <w:numFmt w:val="bullet"/>
+      <w:lvlText w:val="o"/>
+      <w:lvlJc w:val="left"/>
+      <w:pPr>
+        <w:tabs>
+          <w:tab w:val="num" w:pos="1440"/>
+        </w:tabs>
+        <w:ind w:left="1440" w:hanging="360"/>
+      </w:pPr>
+      <w:rPr>
+        <w:rFonts w:ascii="Courier New" w:hAnsi="Courier New" w:hint="default"/>
+        <w:sz w:val="20"/>
+      </w:rPr>
+    </w:lvl>
+    <w:lvl w:ilvl="2" w:tentative="1">
+      <w:start w:val="1"/>
+      <w:numFmt w:val="bullet"/>
+      <w:lvlText w:val=""/>
+      <w:lvlJc w:val="left"/>
+      <w:pPr>
+        <w:tabs>
+          <w:tab w:val="num" w:pos="2160"/>
+        </w:tabs>
+        <w:ind w:left="2160" w:hanging="360"/>
+      </w:pPr>
+      <w:rPr>
+        <w:rFonts w:ascii="Wingdings" w:hAnsi="Wingdings" w:hint="default"/>
+        <w:sz w:val="20"/>
+      </w:rPr>
+    </w:lvl>
+    <w:lvl w:ilvl="3" w:tentative="1">
+      <w:start w:val="1"/>
+      <w:numFmt w:val="bullet"/>
+      <w:lvlText w:val=""/>
+      <w:lvlJc w:val="left"/>
+      <w:pPr>
+        <w:tabs>
+          <w:tab w:val="num" w:pos="2880"/>
+        </w:tabs>
+        <w:ind w:left="2880" w:hanging="360"/>
+      </w:pPr>
+      <w:rPr>
+        <w:rFonts w:ascii="Wingdings" w:hAnsi="Wingdings" w:hint="default"/>
+        <w:sz w:val="20"/>
+      </w:rPr>
+    </w:lvl>
+    <w:lvl w:ilvl="4" w:tentative="1">
+      <w:start w:val="1"/>
+      <w:numFmt w:val="bullet"/>
+      <w:lvlText w:val=""/>
+      <w:lvlJc w:val="left"/>
+      <w:pPr>
+        <w:tabs>
+          <w:tab w:val="num" w:pos="3600"/>
+        </w:tabs>
+        <w:ind w:left="3600" w:hanging="360"/>
+      </w:pPr>
+      <w:rPr>
+        <w:rFonts w:ascii="Wingdings" w:hAnsi="Wingdings" w:hint="default"/>
+        <w:sz w:val="20"/>
+      </w:rPr>
+    </w:lvl>
+    <w:lvl w:ilvl="5" w:tentative="1">
+      <w:start w:val="1"/>
+      <w:numFmt w:val="bullet"/>
+      <w:lvlText w:val=""/>
+      <w:lvlJc w:val="left"/>
+      <w:pPr>
+        <w:tabs>
+          <w:tab w:val="num" w:pos="4320"/>
+        </w:tabs>
+        <w:ind w:left="4320" w:hanging="360"/>
+      </w:pPr>
+      <w:rPr>
+        <w:rFonts w:ascii="Wingdings" w:hAnsi="Wingdings" w:hint="default"/>
+        <w:sz w:val="20"/>
+      </w:rPr>
+    </w:lvl>
+    <w:lvl w:ilvl="6" w:tentative="1">
+      <w:start w:val="1"/>
+      <w:numFmt w:val="bullet"/>
+      <w:lvlText w:val=""/>
+      <w:lvlJc w:val="left"/>
+      <w:pPr>
+        <w:tabs>
+          <w:tab w:val="num" w:pos="5040"/>
+        </w:tabs>
+        <w:ind w:left="5040" w:hanging="360"/>
+      </w:pPr>
+      <w:rPr>
+        <w:rFonts w:ascii="Wingdings" w:hAnsi="Wingdings" w:hint="default"/>
+        <w:sz w:val="20"/>
+      </w:rPr>
+    </w:lvl>
+    <w:lvl w:ilvl="7" w:tentative="1">
+      <w:start w:val="1"/>
+      <w:numFmt w:val="bullet"/>
+      <w:lvlText w:val=""/>
+      <w:lvlJc w:val="left"/>
+      <w:pPr>
+        <w:tabs>
+          <w:tab w:val="num" w:pos="5760"/>
+        </w:tabs>
+        <w:ind w:left="5760" w:hanging="360"/>
+      </w:pPr>
+      <w:rPr>
+        <w:rFonts w:ascii="Wingdings" w:hAnsi="Wingdings" w:hint="default"/>
+        <w:sz w:val="20"/>
+      </w:rPr>
+    </w:lvl>
+    <w:lvl w:ilvl="8" w:tentative="1">
+      <w:start w:val="1"/>
+      <w:numFmt w:val="bullet"/>
+      <w:lvlText w:val=""/>
+      <w:lvlJc w:val="left"/>
+      <w:pPr>
+        <w:tabs>
+          <w:tab w:val="num" w:pos="6480"/>
+        </w:tabs>
+        <w:ind w:left="6480" w:hanging="360"/>
+      </w:pPr>
+      <w:rPr>
+        <w:rFonts w:ascii="Wingdings" w:hAnsi="Wingdings" w:hint="default"/>
+        <w:sz w:val="20"/>
+      </w:rPr>
+    </w:lvl>
+  </w:abstractNum>
+  <w:abstractNum w:abstractNumId="8" w15:restartNumberingAfterBreak="0">
+    <w:nsid w:val="57AD3EBA"/>
+    <w:multiLevelType w:val="multilevel"/>
+    <w:tmpl w:val="27C40D72"/>
+    <w:lvl w:ilvl="0">
+      <w:start w:val="1"/>
+      <w:numFmt w:val="bullet"/>
+      <w:lvlText w:val=""/>
+      <w:lvlJc w:val="left"/>
+      <w:pPr>
+        <w:tabs>
+          <w:tab w:val="num" w:pos="720"/>
+        </w:tabs>
+        <w:ind w:left="720" w:hanging="360"/>
+      </w:pPr>
+      <w:rPr>
+        <w:rFonts w:ascii="Symbol" w:hAnsi="Symbol" w:hint="default"/>
+        <w:sz w:val="20"/>
+      </w:rPr>
+    </w:lvl>
+    <w:lvl w:ilvl="1" w:tentative="1">
+      <w:start w:val="1"/>
+      <w:numFmt w:val="bullet"/>
+      <w:lvlText w:val="o"/>
+      <w:lvlJc w:val="left"/>
+      <w:pPr>
+        <w:tabs>
+          <w:tab w:val="num" w:pos="1440"/>
+        </w:tabs>
+        <w:ind w:left="1440" w:hanging="360"/>
+      </w:pPr>
+      <w:rPr>
+        <w:rFonts w:ascii="Courier New" w:hAnsi="Courier New" w:hint="default"/>
+        <w:sz w:val="20"/>
+      </w:rPr>
+    </w:lvl>
+    <w:lvl w:ilvl="2" w:tentative="1">
+      <w:start w:val="1"/>
+      <w:numFmt w:val="bullet"/>
+      <w:lvlText w:val=""/>
+      <w:lvlJc w:val="left"/>
+      <w:pPr>
+        <w:tabs>
+          <w:tab w:val="num" w:pos="2160"/>
+        </w:tabs>
+        <w:ind w:left="2160" w:hanging="360"/>
+      </w:pPr>
+      <w:rPr>
+        <w:rFonts w:ascii="Wingdings" w:hAnsi="Wingdings" w:hint="default"/>
+        <w:sz w:val="20"/>
+      </w:rPr>
+    </w:lvl>
+    <w:lvl w:ilvl="3" w:tentative="1">
+      <w:start w:val="1"/>
+      <w:numFmt w:val="bullet"/>
+      <w:lvlText w:val=""/>
+      <w:lvlJc w:val="left"/>
+      <w:pPr>
+        <w:tabs>
+          <w:tab w:val="num" w:pos="2880"/>
+        </w:tabs>
+        <w:ind w:left="2880" w:hanging="360"/>
+      </w:pPr>
+      <w:rPr>
+        <w:rFonts w:ascii="Wingdings" w:hAnsi="Wingdings" w:hint="default"/>
+        <w:sz w:val="20"/>
+      </w:rPr>
+    </w:lvl>
+    <w:lvl w:ilvl="4" w:tentative="1">
+      <w:start w:val="1"/>
+      <w:numFmt w:val="bullet"/>
+      <w:lvlText w:val=""/>
+      <w:lvlJc w:val="left"/>
+      <w:pPr>
+        <w:tabs>
+          <w:tab w:val="num" w:pos="3600"/>
+        </w:tabs>
+        <w:ind w:left="3600" w:hanging="360"/>
+      </w:pPr>
+      <w:rPr>
+        <w:rFonts w:ascii="Wingdings" w:hAnsi="Wingdings" w:hint="default"/>
+        <w:sz w:val="20"/>
+      </w:rPr>
+    </w:lvl>
+    <w:lvl w:ilvl="5" w:tentative="1">
+      <w:start w:val="1"/>
+      <w:numFmt w:val="bullet"/>
+      <w:lvlText w:val=""/>
+      <w:lvlJc w:val="left"/>
+      <w:pPr>
+        <w:tabs>
+          <w:tab w:val="num" w:pos="4320"/>
+        </w:tabs>
+        <w:ind w:left="4320" w:hanging="360"/>
+      </w:pPr>
+      <w:rPr>
+        <w:rFonts w:ascii="Wingdings" w:hAnsi="Wingdings" w:hint="default"/>
+        <w:sz w:val="20"/>
+      </w:rPr>
+    </w:lvl>
+    <w:lvl w:ilvl="6" w:tentative="1">
+      <w:start w:val="1"/>
+      <w:numFmt w:val="bullet"/>
+      <w:lvlText w:val=""/>
+      <w:lvlJc w:val="left"/>
+      <w:pPr>
+        <w:tabs>
+          <w:tab w:val="num" w:pos="5040"/>
+        </w:tabs>
+        <w:ind w:left="5040" w:hanging="360"/>
+      </w:pPr>
+      <w:rPr>
+        <w:rFonts w:ascii="Wingdings" w:hAnsi="Wingdings" w:hint="default"/>
+        <w:sz w:val="20"/>
+      </w:rPr>
+    </w:lvl>
+    <w:lvl w:ilvl="7" w:tentative="1">
+      <w:start w:val="1"/>
+      <w:numFmt w:val="bullet"/>
+      <w:lvlText w:val=""/>
+      <w:lvlJc w:val="left"/>
+      <w:pPr>
+        <w:tabs>
+          <w:tab w:val="num" w:pos="5760"/>
+        </w:tabs>
+        <w:ind w:left="5760" w:hanging="360"/>
+      </w:pPr>
+      <w:rPr>
+        <w:rFonts w:ascii="Wingdings" w:hAnsi="Wingdings" w:hint="default"/>
+        <w:sz w:val="20"/>
+      </w:rPr>
+    </w:lvl>
+    <w:lvl w:ilvl="8" w:tentative="1">
+      <w:start w:val="1"/>
+      <w:numFmt w:val="bullet"/>
+      <w:lvlText w:val=""/>
+      <w:lvlJc w:val="left"/>
+      <w:pPr>
+        <w:tabs>
+          <w:tab w:val="num" w:pos="6480"/>
+        </w:tabs>
+        <w:ind w:left="6480" w:hanging="360"/>
+      </w:pPr>
+      <w:rPr>
+        <w:rFonts w:ascii="Wingdings" w:hAnsi="Wingdings" w:hint="default"/>
+        <w:sz w:val="20"/>
+      </w:rPr>
+    </w:lvl>
+  </w:abstractNum>
+  <w:abstractNum w:abstractNumId="9" w15:restartNumberingAfterBreak="0">
     <w:nsid w:val="5D4155C7"/>
     <w:multiLevelType w:val="multilevel"/>
     <w:tmpl w:val="D090BF78"/>
@@ -1997,7 +2704,7 @@
       </w:rPr>
     </w:lvl>
   </w:abstractNum>
-  <w:abstractNum w:abstractNumId="4" w15:restartNumberingAfterBreak="0">
+  <w:abstractNum w:abstractNumId="10" w15:restartNumberingAfterBreak="0">
     <w:nsid w:val="5DEE2DE7"/>
     <w:multiLevelType w:val="multilevel"/>
     <w:tmpl w:val="8B4EB712"/>
@@ -2146,7 +2853,7 @@
       </w:rPr>
     </w:lvl>
   </w:abstractNum>
-  <w:abstractNum w:abstractNumId="5" w15:restartNumberingAfterBreak="0">
+  <w:abstractNum w:abstractNumId="11" w15:restartNumberingAfterBreak="0">
     <w:nsid w:val="6E3952E3"/>
     <w:multiLevelType w:val="multilevel"/>
     <w:tmpl w:val="126C1C98"/>
@@ -2295,7 +3002,7 @@
       </w:rPr>
     </w:lvl>
   </w:abstractNum>
-  <w:abstractNum w:abstractNumId="6" w15:restartNumberingAfterBreak="0">
+  <w:abstractNum w:abstractNumId="12" w15:restartNumberingAfterBreak="0">
     <w:nsid w:val="798C5270"/>
     <w:multiLevelType w:val="multilevel"/>
     <w:tmpl w:val="CA3279C2"/>
@@ -2444,26 +3151,348 @@
       </w:rPr>
     </w:lvl>
   </w:abstractNum>
+  <w:abstractNum w:abstractNumId="13" w15:restartNumberingAfterBreak="0">
+    <w:nsid w:val="7BDE37AA"/>
+    <w:multiLevelType w:val="multilevel"/>
+    <w:tmpl w:val="4F0E649E"/>
+    <w:lvl w:ilvl="0">
+      <w:start w:val="1"/>
+      <w:numFmt w:val="bullet"/>
+      <w:lvlText w:val=""/>
+      <w:lvlJc w:val="left"/>
+      <w:pPr>
+        <w:tabs>
+          <w:tab w:val="num" w:pos="720"/>
+        </w:tabs>
+        <w:ind w:left="720" w:hanging="360"/>
+      </w:pPr>
+      <w:rPr>
+        <w:rFonts w:ascii="Symbol" w:hAnsi="Symbol" w:hint="default"/>
+        <w:sz w:val="20"/>
+      </w:rPr>
+    </w:lvl>
+    <w:lvl w:ilvl="1" w:tentative="1">
+      <w:start w:val="1"/>
+      <w:numFmt w:val="bullet"/>
+      <w:lvlText w:val="o"/>
+      <w:lvlJc w:val="left"/>
+      <w:pPr>
+        <w:tabs>
+          <w:tab w:val="num" w:pos="1440"/>
+        </w:tabs>
+        <w:ind w:left="1440" w:hanging="360"/>
+      </w:pPr>
+      <w:rPr>
+        <w:rFonts w:ascii="Courier New" w:hAnsi="Courier New" w:hint="default"/>
+        <w:sz w:val="20"/>
+      </w:rPr>
+    </w:lvl>
+    <w:lvl w:ilvl="2" w:tentative="1">
+      <w:start w:val="1"/>
+      <w:numFmt w:val="bullet"/>
+      <w:lvlText w:val=""/>
+      <w:lvlJc w:val="left"/>
+      <w:pPr>
+        <w:tabs>
+          <w:tab w:val="num" w:pos="2160"/>
+        </w:tabs>
+        <w:ind w:left="2160" w:hanging="360"/>
+      </w:pPr>
+      <w:rPr>
+        <w:rFonts w:ascii="Wingdings" w:hAnsi="Wingdings" w:hint="default"/>
+        <w:sz w:val="20"/>
+      </w:rPr>
+    </w:lvl>
+    <w:lvl w:ilvl="3" w:tentative="1">
+      <w:start w:val="1"/>
+      <w:numFmt w:val="bullet"/>
+      <w:lvlText w:val=""/>
+      <w:lvlJc w:val="left"/>
+      <w:pPr>
+        <w:tabs>
+          <w:tab w:val="num" w:pos="2880"/>
+        </w:tabs>
+        <w:ind w:left="2880" w:hanging="360"/>
+      </w:pPr>
+      <w:rPr>
+        <w:rFonts w:ascii="Wingdings" w:hAnsi="Wingdings" w:hint="default"/>
+        <w:sz w:val="20"/>
+      </w:rPr>
+    </w:lvl>
+    <w:lvl w:ilvl="4" w:tentative="1">
+      <w:start w:val="1"/>
+      <w:numFmt w:val="bullet"/>
+      <w:lvlText w:val=""/>
+      <w:lvlJc w:val="left"/>
+      <w:pPr>
+        <w:tabs>
+          <w:tab w:val="num" w:pos="3600"/>
+        </w:tabs>
+        <w:ind w:left="3600" w:hanging="360"/>
+      </w:pPr>
+      <w:rPr>
+        <w:rFonts w:ascii="Wingdings" w:hAnsi="Wingdings" w:hint="default"/>
+        <w:sz w:val="20"/>
+      </w:rPr>
+    </w:lvl>
+    <w:lvl w:ilvl="5" w:tentative="1">
+      <w:start w:val="1"/>
+      <w:numFmt w:val="bullet"/>
+      <w:lvlText w:val=""/>
+      <w:lvlJc w:val="left"/>
+      <w:pPr>
+        <w:tabs>
+          <w:tab w:val="num" w:pos="4320"/>
+        </w:tabs>
+        <w:ind w:left="4320" w:hanging="360"/>
+      </w:pPr>
+      <w:rPr>
+        <w:rFonts w:ascii="Wingdings" w:hAnsi="Wingdings" w:hint="default"/>
+        <w:sz w:val="20"/>
+      </w:rPr>
+    </w:lvl>
+    <w:lvl w:ilvl="6" w:tentative="1">
+      <w:start w:val="1"/>
+      <w:numFmt w:val="bullet"/>
+      <w:lvlText w:val=""/>
+      <w:lvlJc w:val="left"/>
+      <w:pPr>
+        <w:tabs>
+          <w:tab w:val="num" w:pos="5040"/>
+        </w:tabs>
+        <w:ind w:left="5040" w:hanging="360"/>
+      </w:pPr>
+      <w:rPr>
+        <w:rFonts w:ascii="Wingdings" w:hAnsi="Wingdings" w:hint="default"/>
+        <w:sz w:val="20"/>
+      </w:rPr>
+    </w:lvl>
+    <w:lvl w:ilvl="7" w:tentative="1">
+      <w:start w:val="1"/>
+      <w:numFmt w:val="bullet"/>
+      <w:lvlText w:val=""/>
+      <w:lvlJc w:val="left"/>
+      <w:pPr>
+        <w:tabs>
+          <w:tab w:val="num" w:pos="5760"/>
+        </w:tabs>
+        <w:ind w:left="5760" w:hanging="360"/>
+      </w:pPr>
+      <w:rPr>
+        <w:rFonts w:ascii="Wingdings" w:hAnsi="Wingdings" w:hint="default"/>
+        <w:sz w:val="20"/>
+      </w:rPr>
+    </w:lvl>
+    <w:lvl w:ilvl="8" w:tentative="1">
+      <w:start w:val="1"/>
+      <w:numFmt w:val="bullet"/>
+      <w:lvlText w:val=""/>
+      <w:lvlJc w:val="left"/>
+      <w:pPr>
+        <w:tabs>
+          <w:tab w:val="num" w:pos="6480"/>
+        </w:tabs>
+        <w:ind w:left="6480" w:hanging="360"/>
+      </w:pPr>
+      <w:rPr>
+        <w:rFonts w:ascii="Wingdings" w:hAnsi="Wingdings" w:hint="default"/>
+        <w:sz w:val="20"/>
+      </w:rPr>
+    </w:lvl>
+  </w:abstractNum>
+  <w:abstractNum w:abstractNumId="14" w15:restartNumberingAfterBreak="0">
+    <w:nsid w:val="7C1A3CD6"/>
+    <w:multiLevelType w:val="multilevel"/>
+    <w:tmpl w:val="169A5870"/>
+    <w:lvl w:ilvl="0">
+      <w:start w:val="1"/>
+      <w:numFmt w:val="bullet"/>
+      <w:lvlText w:val=""/>
+      <w:lvlJc w:val="left"/>
+      <w:pPr>
+        <w:tabs>
+          <w:tab w:val="num" w:pos="720"/>
+        </w:tabs>
+        <w:ind w:left="720" w:hanging="360"/>
+      </w:pPr>
+      <w:rPr>
+        <w:rFonts w:ascii="Symbol" w:hAnsi="Symbol" w:hint="default"/>
+        <w:sz w:val="20"/>
+      </w:rPr>
+    </w:lvl>
+    <w:lvl w:ilvl="1" w:tentative="1">
+      <w:start w:val="1"/>
+      <w:numFmt w:val="bullet"/>
+      <w:lvlText w:val="o"/>
+      <w:lvlJc w:val="left"/>
+      <w:pPr>
+        <w:tabs>
+          <w:tab w:val="num" w:pos="1440"/>
+        </w:tabs>
+        <w:ind w:left="1440" w:hanging="360"/>
+      </w:pPr>
+      <w:rPr>
+        <w:rFonts w:ascii="Courier New" w:hAnsi="Courier New" w:hint="default"/>
+        <w:sz w:val="20"/>
+      </w:rPr>
+    </w:lvl>
+    <w:lvl w:ilvl="2" w:tentative="1">
+      <w:start w:val="1"/>
+      <w:numFmt w:val="bullet"/>
+      <w:lvlText w:val=""/>
+      <w:lvlJc w:val="left"/>
+      <w:pPr>
+        <w:tabs>
+          <w:tab w:val="num" w:pos="2160"/>
+        </w:tabs>
+        <w:ind w:left="2160" w:hanging="360"/>
+      </w:pPr>
+      <w:rPr>
+        <w:rFonts w:ascii="Wingdings" w:hAnsi="Wingdings" w:hint="default"/>
+        <w:sz w:val="20"/>
+      </w:rPr>
+    </w:lvl>
+    <w:lvl w:ilvl="3" w:tentative="1">
+      <w:start w:val="1"/>
+      <w:numFmt w:val="bullet"/>
+      <w:lvlText w:val=""/>
+      <w:lvlJc w:val="left"/>
+      <w:pPr>
+        <w:tabs>
+          <w:tab w:val="num" w:pos="2880"/>
+        </w:tabs>
+        <w:ind w:left="2880" w:hanging="360"/>
+      </w:pPr>
+      <w:rPr>
+        <w:rFonts w:ascii="Wingdings" w:hAnsi="Wingdings" w:hint="default"/>
+        <w:sz w:val="20"/>
+      </w:rPr>
+    </w:lvl>
+    <w:lvl w:ilvl="4" w:tentative="1">
+      <w:start w:val="1"/>
+      <w:numFmt w:val="bullet"/>
+      <w:lvlText w:val=""/>
+      <w:lvlJc w:val="left"/>
+      <w:pPr>
+        <w:tabs>
+          <w:tab w:val="num" w:pos="3600"/>
+        </w:tabs>
+        <w:ind w:left="3600" w:hanging="360"/>
+      </w:pPr>
+      <w:rPr>
+        <w:rFonts w:ascii="Wingdings" w:hAnsi="Wingdings" w:hint="default"/>
+        <w:sz w:val="20"/>
+      </w:rPr>
+    </w:lvl>
+    <w:lvl w:ilvl="5" w:tentative="1">
+      <w:start w:val="1"/>
+      <w:numFmt w:val="bullet"/>
+      <w:lvlText w:val=""/>
+      <w:lvlJc w:val="left"/>
+      <w:pPr>
+        <w:tabs>
+          <w:tab w:val="num" w:pos="4320"/>
+        </w:tabs>
+        <w:ind w:left="4320" w:hanging="360"/>
+      </w:pPr>
+      <w:rPr>
+        <w:rFonts w:ascii="Wingdings" w:hAnsi="Wingdings" w:hint="default"/>
+        <w:sz w:val="20"/>
+      </w:rPr>
+    </w:lvl>
+    <w:lvl w:ilvl="6" w:tentative="1">
+      <w:start w:val="1"/>
+      <w:numFmt w:val="bullet"/>
+      <w:lvlText w:val=""/>
+      <w:lvlJc w:val="left"/>
+      <w:pPr>
+        <w:tabs>
+          <w:tab w:val="num" w:pos="5040"/>
+        </w:tabs>
+        <w:ind w:left="5040" w:hanging="360"/>
+      </w:pPr>
+      <w:rPr>
+        <w:rFonts w:ascii="Wingdings" w:hAnsi="Wingdings" w:hint="default"/>
+        <w:sz w:val="20"/>
+      </w:rPr>
+    </w:lvl>
+    <w:lvl w:ilvl="7" w:tentative="1">
+      <w:start w:val="1"/>
+      <w:numFmt w:val="bullet"/>
+      <w:lvlText w:val=""/>
+      <w:lvlJc w:val="left"/>
+      <w:pPr>
+        <w:tabs>
+          <w:tab w:val="num" w:pos="5760"/>
+        </w:tabs>
+        <w:ind w:left="5760" w:hanging="360"/>
+      </w:pPr>
+      <w:rPr>
+        <w:rFonts w:ascii="Wingdings" w:hAnsi="Wingdings" w:hint="default"/>
+        <w:sz w:val="20"/>
+      </w:rPr>
+    </w:lvl>
+    <w:lvl w:ilvl="8" w:tentative="1">
+      <w:start w:val="1"/>
+      <w:numFmt w:val="bullet"/>
+      <w:lvlText w:val=""/>
+      <w:lvlJc w:val="left"/>
+      <w:pPr>
+        <w:tabs>
+          <w:tab w:val="num" w:pos="6480"/>
+        </w:tabs>
+        <w:ind w:left="6480" w:hanging="360"/>
+      </w:pPr>
+      <w:rPr>
+        <w:rFonts w:ascii="Wingdings" w:hAnsi="Wingdings" w:hint="default"/>
+        <w:sz w:val="20"/>
+      </w:rPr>
+    </w:lvl>
+  </w:abstractNum>
   <w:num w:numId="1">
+    <w:abstractNumId w:val="11"/>
+  </w:num>
+  <w:num w:numId="2">
+    <w:abstractNumId w:val="3"/>
+  </w:num>
+  <w:num w:numId="3">
+    <w:abstractNumId w:val="4"/>
+  </w:num>
+  <w:num w:numId="4">
+    <w:abstractNumId w:val="10"/>
+  </w:num>
+  <w:num w:numId="5">
+    <w:abstractNumId w:val="9"/>
+  </w:num>
+  <w:num w:numId="6">
+    <w:abstractNumId w:val="12"/>
+  </w:num>
+  <w:num w:numId="7">
     <w:abstractNumId w:val="5"/>
   </w:num>
-  <w:num w:numId="2">
+  <w:num w:numId="8">
+    <w:abstractNumId w:val="1"/>
+  </w:num>
+  <w:num w:numId="9">
+    <w:abstractNumId w:val="13"/>
+  </w:num>
+  <w:num w:numId="10">
+    <w:abstractNumId w:val="7"/>
+  </w:num>
+  <w:num w:numId="11">
+    <w:abstractNumId w:val="14"/>
+  </w:num>
+  <w:num w:numId="12">
+    <w:abstractNumId w:val="2"/>
+  </w:num>
+  <w:num w:numId="13">
     <w:abstractNumId w:val="0"/>
   </w:num>
-  <w:num w:numId="3">
-    <w:abstractNumId w:val="1"/>
-  </w:num>
-  <w:num w:numId="4">
-    <w:abstractNumId w:val="4"/>
-  </w:num>
-  <w:num w:numId="5">
-    <w:abstractNumId w:val="3"/>
-  </w:num>
-  <w:num w:numId="6">
+  <w:num w:numId="14">
     <w:abstractNumId w:val="6"/>
   </w:num>
-  <w:num w:numId="7">
-    <w:abstractNumId w:val="2"/>
+  <w:num w:numId="15">
+    <w:abstractNumId w:val="8"/>
   </w:num>
 </w:numbering>
 </file>

</xml_diff>